<commit_message>
Vortrag 4: Belege nach APA 7, Chi-Quadrat-Test entfernt, Überarbeitung
- Notebook, Ausarbeitung und Folien mit Kurzbelegen (Seiten- bzw. Foliennummern)
  und Literaturverzeichnis nach APA 7
- Chi-Quadrat-Test entfernt; Unabhängigkeit nur über die Definition aus dem
  Folienskript beurteilt
- Begriffe aus dem Kurs übernommen (Säulendiagramm, Kreuztabelle)
- Abbildungen und Tabellen im APA-Format, Differenzen aus exakten Anzahlen

Co-Authored-By: Claude Opus 5.5 <noreply@anthropic.com>
Claude-Session: https://claude.ai/code/session_013vrRC9ggswsEWMp2ebeFzZ
</commit_message>
<xml_diff>
--- a/vortrag4/Vortrag4_Ausarbeitung.docx
+++ b/vortrag4/Vortrag4_Ausarbeitung.docx
@@ -58,10 +58,10 @@
         <w:rPr>
           <w:b/>
         </w:rPr>
-        <w:t xml:space="preserve">Modul: </w:t>
-      </w:r>
-      <w:r>
-        <w:t>Statistik (w.BA.XX.2Stat-WIN.XX), Wirtschaftsinformatik</w:t>
+        <w:t xml:space="preserve">Gruppe: </w:t>
+      </w:r>
+      <w:r>
+        <w:t>Leorat Krasniqi, Teoman-Doganay Lam, Filip Lazic</w:t>
       </w:r>
     </w:p>
     <w:p>
@@ -72,10 +72,10 @@
         <w:rPr>
           <w:b/>
         </w:rPr>
-        <w:t xml:space="preserve">Kleinklasse: </w:t>
-      </w:r>
-      <w:r>
-        <w:t>HS 2026, ZHAW School of Management and Law</w:t>
+        <w:t xml:space="preserve">Modul: </w:t>
+      </w:r>
+      <w:r>
+        <w:t>Statistik (w.BA.XX.2Stat-WIN.XX), Wirtschaftsinformatik, 3. Semester</w:t>
       </w:r>
     </w:p>
     <w:p>
@@ -86,10 +86,10 @@
         <w:rPr>
           <w:b/>
         </w:rPr>
-        <w:t xml:space="preserve">Gruppe: </w:t>
-      </w:r>
-      <w:r>
-        <w:t>Leorat Krasniqi, Teoman-Doganay Lam, Filip Lazic</w:t>
+        <w:t xml:space="preserve">Kleinklasse: </w:t>
+      </w:r>
+      <w:r>
+        <w:t>HS 2026, ZHAW School of Management and Law</w:t>
       </w:r>
     </w:p>
     <w:p>
@@ -139,19 +139,25 @@
       </w:r>
     </w:p>
     <w:p>
+      <w:pPr>
+        <w:keepNext w:val="0"/>
+      </w:pPr>
       <w:r>
         <w:rPr>
           <w:i w:val="0"/>
         </w:rPr>
-        <w:t>Im Herbst 1973 bewarben sich an den sechs grössten Fachbereichen (A bis F) der University of California, Berkeley, 4 526 Personen für ein Graduate-Studium. Aggregiert über alle Fachbereiche wurden 44.5 % der Männer, aber nur 30.4 % der Frauen zugelassen. Die Universität befürchtete eine Klage wegen Diskriminierung und liess die Zahlen durch den Statistiker Peter Bickel untersuchen (Bickel, Hammel &amp; O'Connell, 1975). Tabelle 4 der Aufgabenstellung fasst die Daten zusammen: je Fachbereich die Zulassungsquote getrennt nach Geschlecht sowie den Anteil der Bewerbungen, der auf den Fachbereich entfällt.</w:t>
+        <w:t>Im Herbst 1973 gingen an den sechs grössten Fachbereichen (A bis F) der University of California, Berkeley, 4 526 Bewerbungen für ein Graduate-Studium ein. Über alle sechs Fachbereiche zusammen wurden 44.5 % der Männer, aber nur 30.4 % der Frauen zugelassen (R Core Team, o. J.). Bickel et al. (1975) untersuchten die Berkeley-Zahlen auf eine Benachteiligung von Frauen und zeigten, dass der Unterschied auf Ebene der Fachbereiche verschwindet. Tabelle 4 der Aufgabenstellung (ZHAW School of Management and Law [ZHAW SML], 2026) fasst die Daten zusammen: je Fachbereich die Zulassungsquote getrennt nach Geschlecht und den Anteil der Bewerbungen, der auf den Fachbereich entfällt.</w:t>
       </w:r>
     </w:p>
     <w:p>
+      <w:pPr>
+        <w:keepNext/>
+      </w:pPr>
       <w:r>
         <w:rPr>
           <w:i w:val="0"/>
         </w:rPr>
-        <w:t>Die Aufgabe umfasst drei Teile:</w:t>
+        <w:t>Die Aufgabe umfasst drei Teile (ZHAW SML, 2026):</w:t>
       </w:r>
     </w:p>
     <w:p>
@@ -165,6 +171,9 @@
         <w:t xml:space="preserve">(a) </w:t>
       </w:r>
       <w:r>
+        <w:rPr>
+          <w:i w:val="0"/>
+        </w:rPr>
         <w:t>Das Thema Funktionen in Python erläutern, basierend auf McKinney (2018), Abschnitt 3.2.</w:t>
       </w:r>
     </w:p>
@@ -179,6 +188,9 @@
         <w:t xml:space="preserve">(b) </w:t>
       </w:r>
       <w:r>
+        <w:rPr>
+          <w:i w:val="0"/>
+        </w:rPr>
         <w:t>Die Verhältnisse so darstellen, dass ein Betrachter schnell auf eine Ungerechtigkeit im Zulassungsverfahren schliessen kann (Umsetzung in Python).</w:t>
       </w:r>
     </w:p>
@@ -193,15 +205,21 @@
         <w:t xml:space="preserve">(c) </w:t>
       </w:r>
       <w:r>
+        <w:rPr>
+          <w:i w:val="0"/>
+        </w:rPr>
         <w:t>Die Verteilungen von Männern und Frauen bezüglich Zulassung vergleichen, den Vergleich interpretieren und dabei auf die stochastische Unabhängigkeit eingehen.</w:t>
       </w:r>
     </w:p>
     <w:p>
+      <w:pPr>
+        <w:keepNext w:val="0"/>
+      </w:pPr>
       <w:r>
         <w:rPr>
           <w:i w:val="0"/>
         </w:rPr>
-        <w:t>Der vollständige, kommentierte Python-Code befindet sich im Jupyter-Notebook Vortrag4_Berkeley_Analyse.ipynb, das dieser Ausarbeitung beiliegt. Im Text werden die zentralen Ausschnitte gezeigt und erläutert.</w:t>
+        <w:t>Kapitel 2 behandelt Aufgabe (a), Kapitel 3 die statistischen Grundlagen und Kapitel 4 die Vorüberlegungen zur Umsetzung. Kapitel 5 und 6 enthalten die Lösungen zu (b) und (c), Kapitel 7 zieht ein Fazit. Der vollständige, kommentierte Python-Code steht im beiliegenden Jupyter-Notebook Vortrag4_Berkeley_Analyse.ipynb; im Text werden die zentralen Ausschnitte gezeigt.</w:t>
       </w:r>
     </w:p>
     <w:p>
@@ -209,15 +227,18 @@
         <w:pStyle w:val="Heading1"/>
       </w:pPr>
       <w:r>
-        <w:t>2  Theorie I: Funktionen in Python (Aufgabe a)</w:t>
+        <w:t>2  Funktionen in Python (Aufgabe a)</w:t>
       </w:r>
     </w:p>
     <w:p>
+      <w:pPr>
+        <w:keepNext w:val="0"/>
+      </w:pPr>
       <w:r>
         <w:rPr>
           <w:i w:val="0"/>
         </w:rPr>
-        <w:t>Funktionen sind laut McKinney (2018, S. 71) die wichtigste Methode, um Code in Python zu organisieren und wiederzuverwenden. Als Faustregel gilt: Wird derselbe oder ähnlicher Code mehr als einmal benötigt, lohnt sich eine Funktion. Zusätzlich verbessert eine Funktion die Lesbarkeit, weil sie einer Gruppe von Anweisungen einen sprechenden Namen gibt. Im Folgenden werden die Konzepte des Abschnitts 3.2 erklärt und jeweils gezeigt, wo sie in unserer Analyse eingesetzt werden.</w:t>
+        <w:t>Funktionen sind die wichtigste Methode, um Code in Python zu organisieren und wiederzuverwenden (McKinney, 2018, S. 71). Als Faustregel gilt: Wird derselbe oder ähnlicher Code mehr als einmal benötigt, lohnt sich eine Funktion. Zudem macht eine Funktion Code lesbarer, weil sie einer Gruppe von Anweisungen einen Namen gibt (McKinney, 2018, S. 71). Die folgenden Abschnitte erklären die Konzepte aus Abschnitt 3.2 und zeigen jeweils, wo sie in unserer Analyse vorkommen.</w:t>
       </w:r>
     </w:p>
     <w:p>
@@ -229,18 +250,21 @@
       </w:r>
     </w:p>
     <w:p>
+      <w:pPr>
+        <w:keepNext/>
+      </w:pPr>
       <w:r>
         <w:rPr>
           <w:i w:val="0"/>
         </w:rPr>
-        <w:t>Eine Funktion wird mit dem Schlüsselwort def deklariert und mit return verlassen. Es darf mehrere return-Anweisungen geben. Erreicht Python das Ende einer Funktion ohne return, wird automatisch None zurückgegeben. Man unterscheidet Positionsargumente, die über ihre Reihenfolge zugeordnet werden, und Keyword-Argumente, die meist Standardwerte oder optionale Angaben enthalten. Keyword-Argumente müssen immer nach den Positionsargumenten stehen, dürfen untereinander aber in beliebiger Reihenfolge angegeben werden.</w:t>
+        <w:t>Eine Funktion wird mit dem Schlüsselwort def deklariert und mit return verlassen; mehrere return-Anweisungen sind erlaubt (McKinney, 2018, S. 71–72). Erreicht Python das Ende einer Funktion ohne return, wird automatisch None zurückgegeben. Positionsargumente werden über ihre Reihenfolge zugeordnet, Keyword-Argumente über ihren Namen; Letztere dienen meist für Standardwerte oder optionale Angaben. Keyword-Argumente müssen nach den Positionsargumenten stehen, dürfen untereinander aber in beliebiger Reihenfolge angegeben werden (McKinney, 2018, S. 72).</w:t>
       </w:r>
     </w:p>
     <w:p>
       <w:pPr>
+        <w:keepLines/>
         <w:spacing w:after="160"/>
         <w:ind w:left="283"/>
-        <w:keepLines/>
         <w:shd w:val="clear" w:fill="F2F2F2"/>
       </w:pPr>
       <w:r>
@@ -303,15 +327,18 @@
           <w:rFonts w:ascii="Consolas" w:hAnsi="Consolas" w:eastAsia="Consolas"/>
           <w:sz w:val="18"/>
         </w:rPr>
-        <w:t>my_function(10, 20)        # z verwendet Standardwert 1.5</w:t>
+        <w:t>my_function(10, 20)        # z verwendet den Standardwert 1.5</w:t>
       </w:r>
     </w:p>
     <w:p>
+      <w:pPr>
+        <w:keepNext w:val="0"/>
+      </w:pPr>
       <w:r>
         <w:rPr>
           <w:i w:val="0"/>
         </w:rPr>
-        <w:t>In unserer Analyse verwendet die Funktion vierfeldertafel(daten, fachbereich=None) genau dieses Muster: Ohne Angabe des Fachbereichs wird die Tafel über alle Bewerbungen erstellt, mit fachbereich="A" nur für Fachbereich A. Ebenso hat pruefe_unabhaengigkeit(tafel, alpha=0.05) ein Signifikanzniveau als Standardwert.</w:t>
+        <w:t>In unserer Analyse nutzt kreuztabelle(daten, fachbereich=None) genau dieses Muster: Ohne Angabe entsteht die Kreuztabelle über alle Bewerbungen, mit fachbereich="A" nur für Fachbereich A.</w:t>
       </w:r>
     </w:p>
     <w:p>
@@ -323,11 +350,14 @@
       </w:r>
     </w:p>
     <w:p>
+      <w:pPr>
+        <w:keepNext w:val="0"/>
+      </w:pPr>
       <w:r>
         <w:rPr>
           <w:i w:val="0"/>
         </w:rPr>
-        <w:t>Variablen, die innerhalb einer Funktion zugewiesen werden, gehören zum lokalen Namensraum. Dieser entsteht beim Aufruf, wird sofort mit den Argumenten gefüllt und nach dem Beenden der Funktion wieder zerstört. Soll eine Funktion eine Variable ausserhalb ihres Gültigkeitsbereichs neu zuweisen, muss diese mit global deklariert werden. McKinney rät davon ab, weil globale Variablen einen schwer nachvollziehbaren Zustand erzeugen. Wir halten uns daran: Alle Funktionen erhalten ihre Daten als Argument und geben Ergebnisse mit return zurück. Nur Konstanten wie die Farbzuordnung FARBEN werden global gelesen, aber nie verändert.</w:t>
+        <w:t>Variablen, die innerhalb einer Funktion zugewiesen werden, gehören zum lokalen Namensraum. Er entsteht beim Aufruf, wird sofort mit den Argumenten gefüllt und nach dem Ende der Funktion wieder gelöscht (McKinney, 2018, S. 72). Soll eine Funktion eine Variable ausserhalb ihres Gültigkeitsbereichs neu zuweisen, muss diese mit global deklariert werden. McKinney (2018, S. 73) rät davon ab, weil globale Variablen einen schwer überschaubaren Zustand erzeugen. Wir halten uns daran: Alle Funktionen erhalten ihre Daten als Argument und geben Ergebnisse mit return zurück. Nur Konstanten wie die Farbzuordnung FARBEN werden global gelesen, aber nie verändert.</w:t>
       </w:r>
     </w:p>
     <w:p>
@@ -339,18 +369,21 @@
       </w:r>
     </w:p>
     <w:p>
+      <w:pPr>
+        <w:keepNext/>
+      </w:pPr>
       <w:r>
         <w:rPr>
           <w:i w:val="0"/>
         </w:rPr>
-        <w:t>Python kann scheinbar mehrere Werte zurückgeben. Tatsächlich wird ein einziges Tupel zurückgeliefert, das beim Aufruf in mehrere Variablen entpackt wird. Eine Alternative ist die Rückgabe eines Dictionarys, dessen Werte über ihren Namen ansprechbar sind. Wir nutzen beide Varianten:</w:t>
+        <w:t>Python kann scheinbar mehrere Werte zurückgeben. Tatsächlich liefert die Funktion ein einziges Tupel, das beim Aufruf in mehrere Variablen entpackt wird (McKinney, 2018, S. 73). Alternativ kann ein Dictionary zurückgegeben werden, dessen Werte über ihren Namen ansprechbar sind (McKinney, 2018, S. 74). Wir nutzen beide Varianten:</w:t>
       </w:r>
     </w:p>
     <w:p>
       <w:pPr>
+        <w:keepLines/>
         <w:spacing w:after="160"/>
         <w:ind w:left="283"/>
-        <w:keepLines/>
         <w:shd w:val="clear" w:fill="F2F2F2"/>
       </w:pPr>
       <w:r>
@@ -404,7 +437,7 @@
           <w:rFonts w:ascii="Consolas" w:hAnsi="Consolas" w:eastAsia="Consolas"/>
           <w:sz w:val="18"/>
         </w:rPr>
-        <w:t>def pruefe_unabhaengigkeit(tafel, alpha=0.05):</w:t>
+        <w:t>def pruefe_unabhaengigkeit(tafel):</w:t>
         <w:br/>
       </w:r>
       <w:r>
@@ -420,15 +453,18 @@
           <w:rFonts w:ascii="Consolas" w:hAnsi="Consolas" w:eastAsia="Consolas"/>
           <w:sz w:val="18"/>
         </w:rPr>
-        <w:t xml:space="preserve">    return {"P(Z)": p_z, "P(Z|W)": ..., "Chi2": chi2, "p-Wert": p_wert, ...}   # Dictionary</w:t>
+        <w:t xml:space="preserve">    return {"P(Z)": p_z, "P(W)": p_w, "P(Z∩W)": p_z_und_w, "P(Z)·P(W)": p_z * p_w, ...}</w:t>
       </w:r>
     </w:p>
     <w:p>
+      <w:pPr>
+        <w:keepNext w:val="0"/>
+      </w:pPr>
       <w:r>
         <w:rPr>
           <w:i w:val="0"/>
         </w:rPr>
-        <w:t>Das Dictionary eignet sich hier besonders, weil die Funktion neun Kennzahlen liefert. Über Namen wie ergebnis["p-Wert"] bleibt der Code verständlich, und die Sammlung der Dictionaries lässt sich direkt in ein pandas-DataFrame umwandeln.</w:t>
+        <w:t>Das Dictionary passt hier besonders, weil pruefe_unabhaengigkeit neun Kennzahlen liefert. Über Namen wie ergebnis["P(Z∩W)"] bleibt der Code verständlich, und mehrere solche Dictionaries lassen sich direkt in ein pandas-DataFrame umwandeln.</w:t>
       </w:r>
     </w:p>
     <w:p>
@@ -440,18 +476,21 @@
       </w:r>
     </w:p>
     <w:p>
+      <w:pPr>
+        <w:keepNext/>
+      </w:pPr>
       <w:r>
         <w:rPr>
           <w:i w:val="0"/>
         </w:rPr>
-        <w:t>Da Funktionen in Python Objekte sind, können sie in Listen gespeichert, Variablen zugewiesen und anderen Funktionen als Argument übergeben werden. McKinney zeigt dies am Bereinigen unordentlicher Strings: Eine Liste von Operationen wird nacheinander auf jeden Wert angewendet. Genau dieses Muster verwenden wir, um die Prozentangaben aus Tabelle 4 (z. B. "82.4%") in Zahlen umzuwandeln:</w:t>
+        <w:t>Da Funktionen in Python Objekte sind, lassen sie sich in Listen speichern und anderen Funktionen als Argument übergeben (McKinney, 2018, S. 74–75). McKinney zeigt dies am Bereinigen unordentlicher Strings: Eine Liste von Operationen wird nacheinander auf jeden Wert angewendet. Genau dieses Muster verwenden wir, um die Prozentangaben aus Tabelle 4 (z. B. "82.4%") in Zahlen umzuwandeln:</w:t>
       </w:r>
     </w:p>
     <w:p>
       <w:pPr>
+        <w:keepLines/>
         <w:spacing w:after="160"/>
         <w:ind w:left="283"/>
-        <w:keepLines/>
         <w:shd w:val="clear" w:fill="F2F2F2"/>
       </w:pPr>
       <w:r>
@@ -549,11 +588,14 @@
       </w:r>
     </w:p>
     <w:p>
+      <w:pPr>
+        <w:keepNext w:val="0"/>
+      </w:pPr>
       <w:r>
         <w:rPr>
           <w:i w:val="0"/>
         </w:rPr>
-        <w:t>Der Vorteil: Soll ein weiterer Bereinigungsschritt hinzukommen, wird er nur in die Liste eingefügt; die Funktion bereinige bleibt unverändert. Auch unsere Diagrammfunktion balken_beschriften(ax, balken, format_funktion=prozent) erhält die Formatierung als Funktion, vergleichbar mit der eingebauten Funktion map.</w:t>
+        <w:t>Kommt ein weiterer Bereinigungsschritt hinzu, wird er nur in die Liste eingefügt; bereinige bleibt unverändert. Auch die Diagrammfunktion saeulen_beschriften(ax, saeulen, format_funktion=prozent) erhält die Formatierung als Funktion, vergleichbar mit der eingebauten Funktion map (McKinney, 2018, S. 75).</w:t>
       </w:r>
     </w:p>
     <w:p>
@@ -565,18 +607,21 @@
       </w:r>
     </w:p>
     <w:p>
+      <w:pPr>
+        <w:keepNext/>
+      </w:pPr>
       <w:r>
         <w:rPr>
           <w:i w:val="0"/>
         </w:rPr>
-        <w:t>Lambda-Funktionen (anonyme Funktionen) bestehen aus einem einzigen Ausdruck, dessen Ergebnis der Rückgabewert ist. Sie sind praktisch, wenn eine Funktion eine andere Funktion als Argument erwartet. Currying bezeichnet das Ableiten einer neuen Funktion durch teilweises Festlegen von Argumenten, in Python bequem mit functools.partial.</w:t>
+        <w:t>Lambda-Funktionen (anonyme Funktionen) bestehen aus einer einzigen Anweisung, deren Ergebnis der Rückgabewert ist. Sie sind praktisch, wenn eine Funktion eine andere Funktion als Argument erwartet (McKinney, 2018, S. 75–76). Currying bezeichnet das Ableiten einer neuen Funktion durch teilweises Festlegen von Argumenten; in Python geht das mit functools.partial (McKinney, 2018, S. 76–77).</w:t>
       </w:r>
     </w:p>
     <w:p>
       <w:pPr>
+        <w:keepLines/>
         <w:spacing w:after="160"/>
         <w:ind w:left="283"/>
-        <w:keepLines/>
         <w:shd w:val="clear" w:fill="F2F2F2"/>
       </w:pPr>
       <w:r>
@@ -607,7 +652,15 @@
           <w:rFonts w:ascii="Consolas" w:hAnsi="Consolas" w:eastAsia="Consolas"/>
           <w:sz w:val="18"/>
         </w:rPr>
-        <w:t>pruefe_streng = partial(pruefe_unabhaengigkeit, alpha=0.01)   # Test mit alpha = 1 %</w:t>
+        <w:t>quote_frauen = partial(bedingte_quote, geschlecht="Frauen")   # P(Z | W)</w:t>
+        <w:br/>
+      </w:r>
+      <w:r>
+        <w:rPr>
+          <w:rFonts w:ascii="Consolas" w:hAnsi="Consolas" w:eastAsia="Consolas"/>
+          <w:sz w:val="18"/>
+        </w:rPr>
+        <w:t>quote_maenner = partial(bedingte_quote, geschlecht="Männer")  # P(Z | M)</w:t>
       </w:r>
     </w:p>
     <w:p>
@@ -619,18 +672,21 @@
       </w:r>
     </w:p>
     <w:p>
+      <w:pPr>
+        <w:keepNext/>
+      </w:pPr>
       <w:r>
         <w:rPr>
           <w:i w:val="0"/>
         </w:rPr>
-        <w:t>Ein Generator liefert eine Folge von Werten durch Lazy Evaluation: Statt return wird yield verwendet, und die Funktion pausiert nach jedem Wert, bis der nächste angefordert wird. Beim Aufruf wird zunächst kein Code ausgeführt. Unser Generator liefert die Unabhängigkeitsprüfung Fachbereich für Fachbereich; erst pd.DataFrame(dict(...)) fordert alle Werte an:</w:t>
+        <w:t>Ein Generator liefert eine Folge von Werten durch Lazy Evaluation: Statt return wird yield verwendet, und die Funktion pausiert nach jedem Wert, bis der nächste angefordert wird. Beim Aufruf wird zunächst kein Code ausgeführt (McKinney, 2018, S. 77–78). Unser Generator liefert die Unabhängigkeitsprüfung Fachbereich für Fachbereich; erst pd.DataFrame(dict(...)) fordert alle Werte an:</w:t>
       </w:r>
     </w:p>
     <w:p>
       <w:pPr>
+        <w:keepLines/>
         <w:spacing w:after="160"/>
         <w:ind w:left="283"/>
-        <w:keepLines/>
         <w:shd w:val="clear" w:fill="F2F2F2"/>
       </w:pPr>
       <w:r>
@@ -654,7 +710,7 @@
           <w:rFonts w:ascii="Consolas" w:hAnsi="Consolas" w:eastAsia="Consolas"/>
           <w:sz w:val="18"/>
         </w:rPr>
-        <w:t xml:space="preserve">        yield fb, pruefe_unabhaengigkeit(vierfeldertafel(daten, fachbereich=fb))</w:t>
+        <w:t xml:space="preserve">        yield fb, pruefe_unabhaengigkeit(kreuztabelle(daten, fachbereich=fb))</w:t>
         <w:br/>
       </w:r>
       <w:r>
@@ -681,11 +737,14 @@
       </w:r>
     </w:p>
     <w:p>
+      <w:pPr>
+        <w:keepNext w:val="0"/>
+      </w:pPr>
       <w:r>
         <w:rPr>
           <w:i w:val="0"/>
         </w:rPr>
-        <w:t>Mit try/except lassen sich Fehler kontrolliert behandeln. McKinney empfiehlt, nur die erwarteten Ausnahmetypen abzufangen (z. B. ValueError), weil andere Fehler wie TypeError auf echte Bugs hinweisen. Ergänzend gibt es else (wird nur bei Erfolg ausgeführt) und finally (wird immer ausgeführt). In unserer Funktion in_anteil fangen wir nur den ValueError ab, der bei einem Tippfehler in der Tabelle entsteht, und melden ihn mit einer verständlichen Meldung, statt stillschweigend einen falschen Wert weiterzurechnen.</w:t>
+        <w:t>Mit try/except lassen sich Fehler kontrolliert behandeln. Dabei sollte man nur die erwarteten Ausnahmetypen abfangen, etwa ValueError, weil andere Fehler wie TypeError auf echte Programmfehler hinweisen können (McKinney, 2018, S. 79–80). Ergänzend gibt es else, das nur bei Erfolg ausgeführt wird, und finally, das immer ausgeführt wird (McKinney, 2018, S. 81). Unsere Funktion in_anteil fängt nur den ValueError ab, der bei einem Tippfehler in der Tabelle entsteht, und meldet ihn verständlich, statt stillschweigend mit einem falschen Wert weiterzurechnen.</w:t>
       </w:r>
     </w:p>
     <w:p>
@@ -693,7 +752,7 @@
         <w:pStyle w:val="Heading1"/>
       </w:pPr>
       <w:r>
-        <w:t>3  Theorie II: Statistische Grundlagen</w:t>
+        <w:t>3  Statistische Grundlagen</w:t>
       </w:r>
     </w:p>
     <w:p>
@@ -701,34 +760,114 @@
         <w:pStyle w:val="Heading2"/>
       </w:pPr>
       <w:r>
-        <w:t>3.1  Bedingte Wahrscheinlichkeit und stochastische Unabhängigkeit</w:t>
-      </w:r>
-    </w:p>
-    <w:p>
-      <w:r>
-        <w:rPr>
-          <w:i w:val="0"/>
-        </w:rPr>
-        <w:t>Die bedingte Wahrscheinlichkeit P(A | B) = P(A ∩ B) / P(B) ist die Wahrscheinlichkeit von A, wenn B bereits eingetreten ist (P(B) &gt; 0). Zwei Ereignisse A und B heissen stochastisch unabhängig, wenn das Eintreten des einen die Wahrscheinlichkeit des anderen nicht verändert:</w:t>
+        <w:t>3.1  Kreuztabellen und Wahrscheinlichkeitstabellen</w:t>
       </w:r>
     </w:p>
     <w:p>
       <w:pPr>
-        <w:jc w:val="center"/>
+        <w:keepNext w:val="0"/>
       </w:pPr>
       <w:r>
         <w:rPr>
           <w:i w:val="0"/>
         </w:rPr>
-        <w:t>P(A | B) = P(A)   bzw. gleichwertig   P(A ∩ B) = P(A) · P(B).</w:t>
-      </w:r>
-    </w:p>
-    <w:p>
+        <w:t xml:space="preserve">Beziehungen zwischen zwei kategorialen Variablen werden in Kreuztabellen (Kontingenztafeln) dargestellt und grafisch mit gruppierten Säulendiagrammen (Schnauss, o. J.-a, Folien 39, 42). Teilt man die Häufigkeiten durch die Gesamtzahl, entsteht eine Wahrscheinlichkeitstabelle mit gemeinsamen Wahrscheinlichkeiten wie </w:t>
+      </w:r>
+      <w:r>
+        <w:rPr>
+          <w:i/>
+        </w:rPr>
+        <w:t>P</w:t>
+      </w:r>
       <w:r>
         <w:rPr>
           <w:i w:val="0"/>
         </w:rPr>
-        <w:t>Für unsere Fragestellung sei Z das Ereignis «Bewerbung wird zugelassen» und W das Ereignis «Bewerbung stammt von einer Frau». Wäre das Zulassungsverfahren geschlechtsneutral, müsste P(Z | W) = P(Z | M) = P(Z) gelten. Weil empirische Daten nie exakt gleich sind, prüfen wir ergänzend mit dem Chi-Quadrat-Unabhängigkeitstest, ob eine beobachtete Abweichung grösser ist, als durch Zufall zu erwarten wäre (Nullhypothese H0: Z und W sind unabhängig; α = 5 %). Der Test vergleicht die beobachteten Häufigkeiten der Vierfeldertafel mit den bei Unabhängigkeit erwarteten Häufigkeiten n · P(Z) · P(W).</w:t>
+        <w:t>(</w:t>
+      </w:r>
+      <w:r>
+        <w:rPr>
+          <w:i/>
+        </w:rPr>
+        <w:t>A</w:t>
+      </w:r>
+      <w:r>
+        <w:rPr>
+          <w:i w:val="0"/>
+        </w:rPr>
+        <w:t xml:space="preserve"> ∩ </w:t>
+      </w:r>
+      <w:r>
+        <w:rPr>
+          <w:i/>
+        </w:rPr>
+        <w:t>B</w:t>
+      </w:r>
+      <w:r>
+        <w:rPr>
+          <w:i w:val="0"/>
+        </w:rPr>
+        <w:t xml:space="preserve">) im Innern und Randwahrscheinlichkeiten wie </w:t>
+      </w:r>
+      <w:r>
+        <w:rPr>
+          <w:i/>
+        </w:rPr>
+        <w:t>P</w:t>
+      </w:r>
+      <w:r>
+        <w:rPr>
+          <w:i w:val="0"/>
+        </w:rPr>
+        <w:t>(</w:t>
+      </w:r>
+      <w:r>
+        <w:rPr>
+          <w:i/>
+        </w:rPr>
+        <w:t>A</w:t>
+      </w:r>
+      <w:r>
+        <w:rPr>
+          <w:i w:val="0"/>
+        </w:rPr>
+        <w:t xml:space="preserve">) am Rand (Schnauss, o. J.-b, Folie 24). Für die Berkeley-Daten ist </w:t>
+      </w:r>
+      <w:r>
+        <w:rPr>
+          <w:i/>
+        </w:rPr>
+        <w:t>Z</w:t>
+      </w:r>
+      <w:r>
+        <w:rPr>
+          <w:i w:val="0"/>
+        </w:rPr>
+        <w:t xml:space="preserve"> das Ereignis «Bewerbung wird zugelassen» und </w:t>
+      </w:r>
+      <w:r>
+        <w:rPr>
+          <w:i/>
+        </w:rPr>
+        <w:t>W</w:t>
+      </w:r>
+      <w:r>
+        <w:rPr>
+          <w:i w:val="0"/>
+        </w:rPr>
+        <w:t xml:space="preserve"> das Ereignis «Bewerbung stammt von einer Frau» (</w:t>
+      </w:r>
+      <w:r>
+        <w:rPr>
+          <w:i/>
+        </w:rPr>
+        <w:t>M</w:t>
+      </w:r>
+      <w:r>
+        <w:rPr>
+          <w:i w:val="0"/>
+        </w:rPr>
+        <w:t xml:space="preserve"> für Männer).</w:t>
       </w:r>
     </w:p>
     <w:p>
@@ -736,34 +875,588 @@
         <w:pStyle w:val="Heading2"/>
       </w:pPr>
       <w:r>
-        <w:t>3.2  Satz der totalen Wahrscheinlichkeit</w:t>
-      </w:r>
-    </w:p>
-    <w:p>
-      <w:r>
-        <w:rPr>
-          <w:i w:val="0"/>
-        </w:rPr>
-        <w:t>Die Zulassungsquote eines Geschlechts G über alle Fachbereiche ist ein gewichteter Mittelwert der Quoten in den einzelnen Fachbereichen F_i. Die Gewichte sind die Anteile der Bewerbungen:</w:t>
+        <w:t>3.2  Bedingte Wahrscheinlichkeit und stochastische Unabhängigkeit</w:t>
       </w:r>
     </w:p>
     <w:p>
       <w:pPr>
+        <w:keepNext/>
+      </w:pPr>
+      <w:r>
+        <w:rPr>
+          <w:i w:val="0"/>
+        </w:rPr>
+        <w:t xml:space="preserve">Die bedingte Wahrscheinlichkeit </w:t>
+      </w:r>
+      <w:r>
+        <w:rPr>
+          <w:i/>
+        </w:rPr>
+        <w:t>P</w:t>
+      </w:r>
+      <w:r>
+        <w:rPr>
+          <w:i w:val="0"/>
+        </w:rPr>
+        <w:t>(</w:t>
+      </w:r>
+      <w:r>
+        <w:rPr>
+          <w:i/>
+        </w:rPr>
+        <w:t>A</w:t>
+      </w:r>
+      <w:r>
+        <w:rPr>
+          <w:i w:val="0"/>
+        </w:rPr>
+        <w:t xml:space="preserve"> | </w:t>
+      </w:r>
+      <w:r>
+        <w:rPr>
+          <w:i/>
+        </w:rPr>
+        <w:t>B</w:t>
+      </w:r>
+      <w:r>
+        <w:rPr>
+          <w:i w:val="0"/>
+        </w:rPr>
+        <w:t xml:space="preserve">) = </w:t>
+      </w:r>
+      <w:r>
+        <w:rPr>
+          <w:i/>
+        </w:rPr>
+        <w:t>P</w:t>
+      </w:r>
+      <w:r>
+        <w:rPr>
+          <w:i w:val="0"/>
+        </w:rPr>
+        <w:t>(</w:t>
+      </w:r>
+      <w:r>
+        <w:rPr>
+          <w:i/>
+        </w:rPr>
+        <w:t>A</w:t>
+      </w:r>
+      <w:r>
+        <w:rPr>
+          <w:i w:val="0"/>
+        </w:rPr>
+        <w:t xml:space="preserve"> ∩ </w:t>
+      </w:r>
+      <w:r>
+        <w:rPr>
+          <w:i/>
+        </w:rPr>
+        <w:t>B</w:t>
+      </w:r>
+      <w:r>
+        <w:rPr>
+          <w:i w:val="0"/>
+        </w:rPr>
+        <w:t xml:space="preserve">) / </w:t>
+      </w:r>
+      <w:r>
+        <w:rPr>
+          <w:i/>
+        </w:rPr>
+        <w:t>P</w:t>
+      </w:r>
+      <w:r>
+        <w:rPr>
+          <w:i w:val="0"/>
+        </w:rPr>
+        <w:t>(</w:t>
+      </w:r>
+      <w:r>
+        <w:rPr>
+          <w:i/>
+        </w:rPr>
+        <w:t>B</w:t>
+      </w:r>
+      <w:r>
+        <w:rPr>
+          <w:i w:val="0"/>
+        </w:rPr>
+        <w:t xml:space="preserve">) ist die Wahrscheinlichkeit von </w:t>
+      </w:r>
+      <w:r>
+        <w:rPr>
+          <w:i/>
+        </w:rPr>
+        <w:t>A</w:t>
+      </w:r>
+      <w:r>
+        <w:rPr>
+          <w:i w:val="0"/>
+        </w:rPr>
+        <w:t xml:space="preserve">, falls </w:t>
+      </w:r>
+      <w:r>
+        <w:rPr>
+          <w:i/>
+        </w:rPr>
+        <w:t>B</w:t>
+      </w:r>
+      <w:r>
+        <w:rPr>
+          <w:i w:val="0"/>
+        </w:rPr>
+        <w:t xml:space="preserve"> eingetreten ist, mit </w:t>
+      </w:r>
+      <w:r>
+        <w:rPr>
+          <w:i/>
+        </w:rPr>
+        <w:t>P</w:t>
+      </w:r>
+      <w:r>
+        <w:rPr>
+          <w:i w:val="0"/>
+        </w:rPr>
+        <w:t>(</w:t>
+      </w:r>
+      <w:r>
+        <w:rPr>
+          <w:i/>
+        </w:rPr>
+        <w:t>B</w:t>
+      </w:r>
+      <w:r>
+        <w:rPr>
+          <w:i w:val="0"/>
+        </w:rPr>
+        <w:t xml:space="preserve">) &gt; 0 (Schnauss, o. J.-b, Folie 27; vgl. Newbold et al., 2013, Kap. 3). Die Zulassungsquoten in Tabelle 4 sind solche bedingten Wahrscheinlichkeiten, z. B. </w:t>
+      </w:r>
+      <w:r>
+        <w:rPr>
+          <w:i/>
+        </w:rPr>
+        <w:t>P</w:t>
+      </w:r>
+      <w:r>
+        <w:rPr>
+          <w:i w:val="0"/>
+        </w:rPr>
+        <w:t>(</w:t>
+      </w:r>
+      <w:r>
+        <w:rPr>
+          <w:i/>
+        </w:rPr>
+        <w:t>Z</w:t>
+      </w:r>
+      <w:r>
+        <w:rPr>
+          <w:i w:val="0"/>
+        </w:rPr>
+        <w:t xml:space="preserve"> | </w:t>
+      </w:r>
+      <w:r>
+        <w:rPr>
+          <w:i/>
+        </w:rPr>
+        <w:t>W</w:t>
+      </w:r>
+      <w:r>
+        <w:rPr>
+          <w:i w:val="0"/>
+        </w:rPr>
+        <w:t>). Zwei Ereignisse sind stochastisch unabhängig, wenn die Wahrscheinlichkeit des einen nicht vom Eintreten des anderen abhängt (Schnauss, o. J.-b, Folie 34):</w:t>
+      </w:r>
+    </w:p>
+    <w:p>
+      <w:pPr>
+        <w:keepNext w:val="0"/>
+        <w:spacing w:before="80" w:after="160"/>
         <w:jc w:val="center"/>
       </w:pPr>
       <w:r>
         <w:rPr>
+          <w:i/>
+        </w:rPr>
+        <w:t>P</w:t>
+      </w:r>
+      <w:r>
+        <w:rPr>
           <w:i w:val="0"/>
         </w:rPr>
-        <w:t>P(Z | G) = Σ_i  P(F_i | G) · P(Z | F_i, G)</w:t>
+        <w:t>(</w:t>
+      </w:r>
+      <w:r>
+        <w:rPr>
+          <w:i/>
+        </w:rPr>
+        <w:t>A</w:t>
+      </w:r>
+      <w:r>
+        <w:rPr>
+          <w:i w:val="0"/>
+        </w:rPr>
+        <w:t xml:space="preserve"> | </w:t>
+      </w:r>
+      <w:r>
+        <w:rPr>
+          <w:i/>
+        </w:rPr>
+        <w:t>B</w:t>
+      </w:r>
+      <w:r>
+        <w:rPr>
+          <w:i w:val="0"/>
+        </w:rPr>
+        <w:t xml:space="preserve">) = </w:t>
+      </w:r>
+      <w:r>
+        <w:rPr>
+          <w:i/>
+        </w:rPr>
+        <w:t>P</w:t>
+      </w:r>
+      <w:r>
+        <w:rPr>
+          <w:i w:val="0"/>
+        </w:rPr>
+        <w:t>(</w:t>
+      </w:r>
+      <w:r>
+        <w:rPr>
+          <w:i/>
+        </w:rPr>
+        <w:t>A</w:t>
+      </w:r>
+      <w:r>
+        <w:rPr>
+          <w:i w:val="0"/>
+        </w:rPr>
+        <w:t xml:space="preserve">)    bzw. gleichwertig    </w:t>
+      </w:r>
+      <w:r>
+        <w:rPr>
+          <w:i/>
+        </w:rPr>
+        <w:t>P</w:t>
+      </w:r>
+      <w:r>
+        <w:rPr>
+          <w:i w:val="0"/>
+        </w:rPr>
+        <w:t>(</w:t>
+      </w:r>
+      <w:r>
+        <w:rPr>
+          <w:i/>
+        </w:rPr>
+        <w:t>A</w:t>
+      </w:r>
+      <w:r>
+        <w:rPr>
+          <w:i w:val="0"/>
+        </w:rPr>
+        <w:t xml:space="preserve"> ∩ </w:t>
+      </w:r>
+      <w:r>
+        <w:rPr>
+          <w:i/>
+        </w:rPr>
+        <w:t>B</w:t>
+      </w:r>
+      <w:r>
+        <w:rPr>
+          <w:i w:val="0"/>
+        </w:rPr>
+        <w:t xml:space="preserve">) = </w:t>
+      </w:r>
+      <w:r>
+        <w:rPr>
+          <w:i/>
+        </w:rPr>
+        <w:t>P</w:t>
+      </w:r>
+      <w:r>
+        <w:rPr>
+          <w:i w:val="0"/>
+        </w:rPr>
+        <w:t>(</w:t>
+      </w:r>
+      <w:r>
+        <w:rPr>
+          <w:i/>
+        </w:rPr>
+        <w:t>A</w:t>
+      </w:r>
+      <w:r>
+        <w:rPr>
+          <w:i w:val="0"/>
+        </w:rPr>
+        <w:t xml:space="preserve">) · </w:t>
+      </w:r>
+      <w:r>
+        <w:rPr>
+          <w:i/>
+        </w:rPr>
+        <w:t>P</w:t>
+      </w:r>
+      <w:r>
+        <w:rPr>
+          <w:i w:val="0"/>
+        </w:rPr>
+        <w:t>(</w:t>
+      </w:r>
+      <w:r>
+        <w:rPr>
+          <w:i/>
+        </w:rPr>
+        <w:t>B</w:t>
+      </w:r>
+      <w:r>
+        <w:rPr>
+          <w:i w:val="0"/>
+        </w:rPr>
+        <w:t>)</w:t>
       </w:r>
     </w:p>
     <w:p>
+      <w:pPr>
+        <w:keepNext w:val="0"/>
+      </w:pPr>
       <w:r>
         <w:rPr>
           <w:i w:val="0"/>
         </w:rPr>
-        <w:t>Diese Formel ist der Schlüssel zum Datensatz. Die Gesamtquote hängt nicht nur davon ab, wie erfolgreich Frauen bzw. Männer in einem Fachbereich sind, sondern auch davon, wie sich ihre Bewerbungen auf die Fachbereiche verteilen. Mit den Werten aus Tabelle 4 ergibt sich für Frauen 0.059·0.824 + 0.014·0.680 + … + 0.186·0.070 = 30.4 % und für Männer 44.6 % (Tabelle: 44.5 %; die Differenz entsteht durch Rundung). Damit ist die Datenerfassung plausibilisiert.</w:t>
+        <w:t xml:space="preserve">Wäre das Zulassungsverfahren geschlechtsneutral, müsste also </w:t>
+      </w:r>
+      <w:r>
+        <w:rPr>
+          <w:i/>
+        </w:rPr>
+        <w:t>P</w:t>
+      </w:r>
+      <w:r>
+        <w:rPr>
+          <w:i w:val="0"/>
+        </w:rPr>
+        <w:t>(</w:t>
+      </w:r>
+      <w:r>
+        <w:rPr>
+          <w:i/>
+        </w:rPr>
+        <w:t>Z</w:t>
+      </w:r>
+      <w:r>
+        <w:rPr>
+          <w:i w:val="0"/>
+        </w:rPr>
+        <w:t xml:space="preserve"> ∩ </w:t>
+      </w:r>
+      <w:r>
+        <w:rPr>
+          <w:i/>
+        </w:rPr>
+        <w:t>W</w:t>
+      </w:r>
+      <w:r>
+        <w:rPr>
+          <w:i w:val="0"/>
+        </w:rPr>
+        <w:t xml:space="preserve">) = </w:t>
+      </w:r>
+      <w:r>
+        <w:rPr>
+          <w:i/>
+        </w:rPr>
+        <w:t>P</w:t>
+      </w:r>
+      <w:r>
+        <w:rPr>
+          <w:i w:val="0"/>
+        </w:rPr>
+        <w:t>(</w:t>
+      </w:r>
+      <w:r>
+        <w:rPr>
+          <w:i/>
+        </w:rPr>
+        <w:t>Z</w:t>
+      </w:r>
+      <w:r>
+        <w:rPr>
+          <w:i w:val="0"/>
+        </w:rPr>
+        <w:t xml:space="preserve">) · </w:t>
+      </w:r>
+      <w:r>
+        <w:rPr>
+          <w:i/>
+        </w:rPr>
+        <w:t>P</w:t>
+      </w:r>
+      <w:r>
+        <w:rPr>
+          <w:i w:val="0"/>
+        </w:rPr>
+        <w:t>(</w:t>
+      </w:r>
+      <w:r>
+        <w:rPr>
+          <w:i/>
+        </w:rPr>
+        <w:t>W</w:t>
+      </w:r>
+      <w:r>
+        <w:rPr>
+          <w:i w:val="0"/>
+        </w:rPr>
+        <w:t xml:space="preserve">) bzw. </w:t>
+      </w:r>
+      <w:r>
+        <w:rPr>
+          <w:i/>
+        </w:rPr>
+        <w:t>P</w:t>
+      </w:r>
+      <w:r>
+        <w:rPr>
+          <w:i w:val="0"/>
+        </w:rPr>
+        <w:t>(</w:t>
+      </w:r>
+      <w:r>
+        <w:rPr>
+          <w:i/>
+        </w:rPr>
+        <w:t>Z</w:t>
+      </w:r>
+      <w:r>
+        <w:rPr>
+          <w:i w:val="0"/>
+        </w:rPr>
+        <w:t xml:space="preserve"> | </w:t>
+      </w:r>
+      <w:r>
+        <w:rPr>
+          <w:i/>
+        </w:rPr>
+        <w:t>W</w:t>
+      </w:r>
+      <w:r>
+        <w:rPr>
+          <w:i w:val="0"/>
+        </w:rPr>
+        <w:t xml:space="preserve">) = </w:t>
+      </w:r>
+      <w:r>
+        <w:rPr>
+          <w:i/>
+        </w:rPr>
+        <w:t>P</w:t>
+      </w:r>
+      <w:r>
+        <w:rPr>
+          <w:i w:val="0"/>
+        </w:rPr>
+        <w:t>(</w:t>
+      </w:r>
+      <w:r>
+        <w:rPr>
+          <w:i/>
+        </w:rPr>
+        <w:t>Z</w:t>
+      </w:r>
+      <w:r>
+        <w:rPr>
+          <w:i w:val="0"/>
+        </w:rPr>
+        <w:t xml:space="preserve">) gelten. Das Vorgehen entspricht dem Beispiel «Navi und Klimaanlage» im Folienskript, bei dem </w:t>
+      </w:r>
+      <w:r>
+        <w:rPr>
+          <w:i/>
+        </w:rPr>
+        <w:t>P</w:t>
+      </w:r>
+      <w:r>
+        <w:rPr>
+          <w:i w:val="0"/>
+        </w:rPr>
+        <w:t>(</w:t>
+      </w:r>
+      <w:r>
+        <w:rPr>
+          <w:i/>
+        </w:rPr>
+        <w:t>KA</w:t>
+      </w:r>
+      <w:r>
+        <w:rPr>
+          <w:i w:val="0"/>
+        </w:rPr>
+        <w:t xml:space="preserve"> ∩ </w:t>
+      </w:r>
+      <w:r>
+        <w:rPr>
+          <w:i/>
+        </w:rPr>
+        <w:t>Navi</w:t>
+      </w:r>
+      <w:r>
+        <w:rPr>
+          <w:i w:val="0"/>
+        </w:rPr>
+        <w:t xml:space="preserve">) mit </w:t>
+      </w:r>
+      <w:r>
+        <w:rPr>
+          <w:i/>
+        </w:rPr>
+        <w:t>P</w:t>
+      </w:r>
+      <w:r>
+        <w:rPr>
+          <w:i w:val="0"/>
+        </w:rPr>
+        <w:t>(</w:t>
+      </w:r>
+      <w:r>
+        <w:rPr>
+          <w:i/>
+        </w:rPr>
+        <w:t>KA</w:t>
+      </w:r>
+      <w:r>
+        <w:rPr>
+          <w:i w:val="0"/>
+        </w:rPr>
+        <w:t xml:space="preserve">) · </w:t>
+      </w:r>
+      <w:r>
+        <w:rPr>
+          <w:i/>
+        </w:rPr>
+        <w:t>P</w:t>
+      </w:r>
+      <w:r>
+        <w:rPr>
+          <w:i w:val="0"/>
+        </w:rPr>
+        <w:t>(</w:t>
+      </w:r>
+      <w:r>
+        <w:rPr>
+          <w:i/>
+        </w:rPr>
+        <w:t>Navi</w:t>
+      </w:r>
+      <w:r>
+        <w:rPr>
+          <w:i w:val="0"/>
+        </w:rPr>
+        <w:t>) verglichen wird (Schnauss, o. J.-b, Folien 35–36).</w:t>
       </w:r>
     </w:p>
     <w:p>
@@ -771,15 +1464,498 @@
         <w:pStyle w:val="Heading2"/>
       </w:pPr>
       <w:r>
-        <w:t>3.3  Simpson-Paradoxon und bedingte Unabhängigkeit</w:t>
+        <w:t>3.3  Satz der totalen Wahrscheinlichkeit</w:t>
       </w:r>
     </w:p>
     <w:p>
+      <w:pPr>
+        <w:keepNext/>
+      </w:pPr>
       <w:r>
         <w:rPr>
           <w:i w:val="0"/>
         </w:rPr>
-        <w:t>Ein Simpson-Paradoxon liegt vor, wenn ein Zusammenhang, der in jeder Teilgruppe gilt, beim Zusammenfassen der Gruppen verschwindet oder sich sogar umkehrt. Ursache ist eine Drittvariable (Confounder), die sowohl mit der erklärenden Variable (Geschlecht) als auch mit der Zielvariable (Zulassung) zusammenhängt. Daraus folgt, dass zwei Ereignisse insgesamt abhängig und gleichzeitig innerhalb jeder Teilgruppe unabhängig sein können: P(Z ∩ W | F_i) = P(Z | F_i) · P(W | F_i) für alle i (bedingte Unabhängigkeit) impliziert nicht P(Z ∩ W) = P(Z) · P(W).</w:t>
+        <w:t xml:space="preserve">Im Baumdiagramm ergibt sich die Wahrscheinlichkeit eines Ereignisses als Summe über alle Wege, die dorthin führen: </w:t>
+      </w:r>
+      <w:r>
+        <w:rPr>
+          <w:i/>
+        </w:rPr>
+        <w:t>P</w:t>
+      </w:r>
+      <w:r>
+        <w:rPr>
+          <w:i w:val="0"/>
+        </w:rPr>
+        <w:t>(</w:t>
+      </w:r>
+      <w:r>
+        <w:rPr>
+          <w:i/>
+        </w:rPr>
+        <w:t>B</w:t>
+      </w:r>
+      <w:r>
+        <w:rPr>
+          <w:i w:val="0"/>
+        </w:rPr>
+        <w:t xml:space="preserve">) = </w:t>
+      </w:r>
+      <w:r>
+        <w:rPr>
+          <w:i/>
+        </w:rPr>
+        <w:t>P</w:t>
+      </w:r>
+      <w:r>
+        <w:rPr>
+          <w:i w:val="0"/>
+        </w:rPr>
+        <w:t>(</w:t>
+      </w:r>
+      <w:r>
+        <w:rPr>
+          <w:i/>
+        </w:rPr>
+        <w:t>A</w:t>
+      </w:r>
+      <w:r>
+        <w:rPr>
+          <w:i w:val="0"/>
+        </w:rPr>
+        <w:t xml:space="preserve">) · </w:t>
+      </w:r>
+      <w:r>
+        <w:rPr>
+          <w:i/>
+        </w:rPr>
+        <w:t>P</w:t>
+      </w:r>
+      <w:r>
+        <w:rPr>
+          <w:i w:val="0"/>
+        </w:rPr>
+        <w:t>(</w:t>
+      </w:r>
+      <w:r>
+        <w:rPr>
+          <w:i/>
+        </w:rPr>
+        <w:t>B</w:t>
+      </w:r>
+      <w:r>
+        <w:rPr>
+          <w:i w:val="0"/>
+        </w:rPr>
+        <w:t xml:space="preserve"> | </w:t>
+      </w:r>
+      <w:r>
+        <w:rPr>
+          <w:i/>
+        </w:rPr>
+        <w:t>A</w:t>
+      </w:r>
+      <w:r>
+        <w:rPr>
+          <w:i w:val="0"/>
+        </w:rPr>
+        <w:t xml:space="preserve">) + </w:t>
+      </w:r>
+      <w:r>
+        <w:rPr>
+          <w:i/>
+        </w:rPr>
+        <w:t>P</w:t>
+      </w:r>
+      <w:r>
+        <w:rPr>
+          <w:i w:val="0"/>
+        </w:rPr>
+        <w:t>(</w:t>
+      </w:r>
+      <w:r>
+        <w:rPr>
+          <w:i/>
+        </w:rPr>
+        <w:t>Ā</w:t>
+      </w:r>
+      <w:r>
+        <w:rPr>
+          <w:i w:val="0"/>
+        </w:rPr>
+        <w:t xml:space="preserve">) · </w:t>
+      </w:r>
+      <w:r>
+        <w:rPr>
+          <w:i/>
+        </w:rPr>
+        <w:t>P</w:t>
+      </w:r>
+      <w:r>
+        <w:rPr>
+          <w:i w:val="0"/>
+        </w:rPr>
+        <w:t>(</w:t>
+      </w:r>
+      <w:r>
+        <w:rPr>
+          <w:i/>
+        </w:rPr>
+        <w:t>B</w:t>
+      </w:r>
+      <w:r>
+        <w:rPr>
+          <w:i w:val="0"/>
+        </w:rPr>
+        <w:t xml:space="preserve"> | </w:t>
+      </w:r>
+      <w:r>
+        <w:rPr>
+          <w:i/>
+        </w:rPr>
+        <w:t>Ā</w:t>
+      </w:r>
+      <w:r>
+        <w:rPr>
+          <w:i w:val="0"/>
+        </w:rPr>
+        <w:t xml:space="preserve">) (Schnauss, o. J.-b, Folie 37). Verallgemeinert auf die sechs Fachbereiche </w:t>
+      </w:r>
+      <w:r>
+        <w:rPr>
+          <w:i/>
+        </w:rPr>
+        <w:t>F</w:t>
+      </w:r>
+      <w:r>
+        <w:rPr>
+          <w:i w:val="0"/>
+        </w:rPr>
+        <w:t xml:space="preserve">ᵢ gilt für die Zulassungsquote eines Geschlechts </w:t>
+      </w:r>
+      <w:r>
+        <w:rPr>
+          <w:i/>
+        </w:rPr>
+        <w:t>G</w:t>
+      </w:r>
+      <w:r>
+        <w:rPr>
+          <w:i w:val="0"/>
+        </w:rPr>
+        <w:t>:</w:t>
+      </w:r>
+    </w:p>
+    <w:p>
+      <w:pPr>
+        <w:keepNext w:val="0"/>
+        <w:spacing w:before="80" w:after="160"/>
+        <w:jc w:val="center"/>
+      </w:pPr>
+      <w:r>
+        <w:rPr>
+          <w:i/>
+        </w:rPr>
+        <w:t>P</w:t>
+      </w:r>
+      <w:r>
+        <w:rPr>
+          <w:i w:val="0"/>
+        </w:rPr>
+        <w:t>(</w:t>
+      </w:r>
+      <w:r>
+        <w:rPr>
+          <w:i/>
+        </w:rPr>
+        <w:t>Z</w:t>
+      </w:r>
+      <w:r>
+        <w:rPr>
+          <w:i w:val="0"/>
+        </w:rPr>
+        <w:t xml:space="preserve"> | </w:t>
+      </w:r>
+      <w:r>
+        <w:rPr>
+          <w:i/>
+        </w:rPr>
+        <w:t>G</w:t>
+      </w:r>
+      <w:r>
+        <w:rPr>
+          <w:i w:val="0"/>
+        </w:rPr>
+        <w:t xml:space="preserve">) = Σᵢ </w:t>
+      </w:r>
+      <w:r>
+        <w:rPr>
+          <w:i/>
+        </w:rPr>
+        <w:t>P</w:t>
+      </w:r>
+      <w:r>
+        <w:rPr>
+          <w:i w:val="0"/>
+        </w:rPr>
+        <w:t>(</w:t>
+      </w:r>
+      <w:r>
+        <w:rPr>
+          <w:i/>
+        </w:rPr>
+        <w:t>F</w:t>
+      </w:r>
+      <w:r>
+        <w:rPr>
+          <w:i w:val="0"/>
+        </w:rPr>
+        <w:t xml:space="preserve">ᵢ | </w:t>
+      </w:r>
+      <w:r>
+        <w:rPr>
+          <w:i/>
+        </w:rPr>
+        <w:t>G</w:t>
+      </w:r>
+      <w:r>
+        <w:rPr>
+          <w:i w:val="0"/>
+        </w:rPr>
+        <w:t xml:space="preserve">) · </w:t>
+      </w:r>
+      <w:r>
+        <w:rPr>
+          <w:i/>
+        </w:rPr>
+        <w:t>P</w:t>
+      </w:r>
+      <w:r>
+        <w:rPr>
+          <w:i w:val="0"/>
+        </w:rPr>
+        <w:t>(</w:t>
+      </w:r>
+      <w:r>
+        <w:rPr>
+          <w:i/>
+        </w:rPr>
+        <w:t>Z</w:t>
+      </w:r>
+      <w:r>
+        <w:rPr>
+          <w:i w:val="0"/>
+        </w:rPr>
+        <w:t xml:space="preserve"> | </w:t>
+      </w:r>
+      <w:r>
+        <w:rPr>
+          <w:i/>
+        </w:rPr>
+        <w:t>F</w:t>
+      </w:r>
+      <w:r>
+        <w:rPr>
+          <w:i w:val="0"/>
+        </w:rPr>
+        <w:t xml:space="preserve">ᵢ, </w:t>
+      </w:r>
+      <w:r>
+        <w:rPr>
+          <w:i/>
+        </w:rPr>
+        <w:t>G</w:t>
+      </w:r>
+      <w:r>
+        <w:rPr>
+          <w:i w:val="0"/>
+        </w:rPr>
+        <w:t>)</w:t>
+      </w:r>
+    </w:p>
+    <w:p>
+      <w:pPr>
+        <w:keepNext w:val="0"/>
+      </w:pPr>
+      <w:r>
+        <w:rPr>
+          <w:i w:val="0"/>
+        </w:rPr>
+        <w:t>Die Gesamtquote ist also ein gewichteter Mittelwert der Fachbereichsquoten, gewichtet mit der Verteilung der Bewerbungen auf die Fachbereiche. Sie hängt damit nicht nur davon ab, wie erfolgreich Frauen bzw. Männer in einem Fachbereich sind, sondern auch davon, wo sie sich bewerben. Mit den Werten aus Tabelle 4 ergibt sich für Frauen 0.059 · 0.824 + 0.014 · 0.680 + … + 0.186 · 0.070 = 30.4 % und für Männer 44.6 % (Tabelle 4: 44.5 %; die Differenz entsteht durch Rundung). Damit ist die Datenerfassung plausibilisiert.</w:t>
+      </w:r>
+    </w:p>
+    <w:p>
+      <w:pPr>
+        <w:keepNext w:val="0"/>
+      </w:pPr>
+      <w:r>
+        <w:rPr>
+          <w:i w:val="0"/>
+        </w:rPr>
+        <w:t xml:space="preserve">Aus derselben Formel folgt ein nützlicher Zusammenhang: </w:t>
+      </w:r>
+      <w:r>
+        <w:rPr>
+          <w:i/>
+        </w:rPr>
+        <w:t>P</w:t>
+      </w:r>
+      <w:r>
+        <w:rPr>
+          <w:i w:val="0"/>
+        </w:rPr>
+        <w:t>(</w:t>
+      </w:r>
+      <w:r>
+        <w:rPr>
+          <w:i/>
+        </w:rPr>
+        <w:t>Z</w:t>
+      </w:r>
+      <w:r>
+        <w:rPr>
+          <w:i w:val="0"/>
+        </w:rPr>
+        <w:t xml:space="preserve">) ist ein gewichteter Mittelwert aus </w:t>
+      </w:r>
+      <w:r>
+        <w:rPr>
+          <w:i/>
+        </w:rPr>
+        <w:t>P</w:t>
+      </w:r>
+      <w:r>
+        <w:rPr>
+          <w:i w:val="0"/>
+        </w:rPr>
+        <w:t>(</w:t>
+      </w:r>
+      <w:r>
+        <w:rPr>
+          <w:i/>
+        </w:rPr>
+        <w:t>Z</w:t>
+      </w:r>
+      <w:r>
+        <w:rPr>
+          <w:i w:val="0"/>
+        </w:rPr>
+        <w:t xml:space="preserve"> | </w:t>
+      </w:r>
+      <w:r>
+        <w:rPr>
+          <w:i/>
+        </w:rPr>
+        <w:t>W</w:t>
+      </w:r>
+      <w:r>
+        <w:rPr>
+          <w:i w:val="0"/>
+        </w:rPr>
+        <w:t xml:space="preserve">) und </w:t>
+      </w:r>
+      <w:r>
+        <w:rPr>
+          <w:i/>
+        </w:rPr>
+        <w:t>P</w:t>
+      </w:r>
+      <w:r>
+        <w:rPr>
+          <w:i w:val="0"/>
+        </w:rPr>
+        <w:t>(</w:t>
+      </w:r>
+      <w:r>
+        <w:rPr>
+          <w:i/>
+        </w:rPr>
+        <w:t>Z</w:t>
+      </w:r>
+      <w:r>
+        <w:rPr>
+          <w:i w:val="0"/>
+        </w:rPr>
+        <w:t xml:space="preserve"> | </w:t>
+      </w:r>
+      <w:r>
+        <w:rPr>
+          <w:i/>
+        </w:rPr>
+        <w:t>M</w:t>
+      </w:r>
+      <w:r>
+        <w:rPr>
+          <w:i w:val="0"/>
+        </w:rPr>
+        <w:t xml:space="preserve">). Deshalb sind </w:t>
+      </w:r>
+      <w:r>
+        <w:rPr>
+          <w:i/>
+        </w:rPr>
+        <w:t>Z</w:t>
+      </w:r>
+      <w:r>
+        <w:rPr>
+          <w:i w:val="0"/>
+        </w:rPr>
+        <w:t xml:space="preserve"> und </w:t>
+      </w:r>
+      <w:r>
+        <w:rPr>
+          <w:i/>
+        </w:rPr>
+        <w:t>W</w:t>
+      </w:r>
+      <w:r>
+        <w:rPr>
+          <w:i w:val="0"/>
+        </w:rPr>
+        <w:t xml:space="preserve"> genau dann unabhängig, wenn Frauen und Männer dieselbe Zulassungsquote haben.</w:t>
+      </w:r>
+    </w:p>
+    <w:p>
+      <w:pPr>
+        <w:pStyle w:val="Heading2"/>
+      </w:pPr>
+      <w:r>
+        <w:t>3.4  Simpson-Paradoxon</w:t>
+      </w:r>
+    </w:p>
+    <w:p>
+      <w:pPr>
+        <w:keepNext w:val="0"/>
+      </w:pPr>
+      <w:r>
+        <w:rPr>
+          <w:i w:val="0"/>
+        </w:rPr>
+        <w:t xml:space="preserve">Ein Zusammenhang zwischen zwei Merkmalen kann sich abschwächen, verschwinden oder sogar umkehren, wenn man Daten aus mehreren Gruppen zusammenfasst. Dieses Phänomen heisst nach Simpson (1951) Simpson-Paradoxon. Es tritt auf, wenn eine Drittvariable, hier der Fachbereich, sowohl mit dem Geschlecht als auch mit der Zulassung zusammenhängt. Die Berkeley-Daten gelten als das bekannteste Beispiel dafür (Bickel et al., 1975; R Core Team, o. J.). Für die Unabhängigkeit bedeutet das: </w:t>
+      </w:r>
+      <w:r>
+        <w:rPr>
+          <w:i/>
+        </w:rPr>
+        <w:t>Z</w:t>
+      </w:r>
+      <w:r>
+        <w:rPr>
+          <w:i w:val="0"/>
+        </w:rPr>
+        <w:t xml:space="preserve"> und </w:t>
+      </w:r>
+      <w:r>
+        <w:rPr>
+          <w:i/>
+        </w:rPr>
+        <w:t>W</w:t>
+      </w:r>
+      <w:r>
+        <w:rPr>
+          <w:i w:val="0"/>
+        </w:rPr>
+        <w:t xml:space="preserve"> können insgesamt abhängig und innerhalb jedes Fachbereichs trotzdem (annähernd) unabhängig sein.</w:t>
       </w:r>
     </w:p>
     <w:p>
@@ -791,6 +1967,9 @@
       </w:r>
     </w:p>
     <w:p>
+      <w:pPr>
+        <w:keepNext/>
+      </w:pPr>
       <w:r>
         <w:rPr>
           <w:i w:val="0"/>
@@ -809,7 +1988,70 @@
         <w:t xml:space="preserve">Welche Daten liegen vor? </w:t>
       </w:r>
       <w:r>
-        <w:t>Tabelle 4 enthält nur Prozentwerte, keine Anzahlen und kein Verhältnis Frauen zu Männern. Für Aufgabe (b) und die bedingten Quoten reicht das. Für P(W), P(Z ∩ W) und den Chi-Quadrat-Test braucht es jedoch absolute Häufigkeiten.</w:t>
+        <w:rPr>
+          <w:i w:val="0"/>
+        </w:rPr>
+        <w:t xml:space="preserve">Tabelle 4 enthält nur Prozentwerte, keine Anzahlen und kein Verhältnis Frauen zu Männern. Für Aufgabe (b) und die bedingten Quoten reicht das. Für </w:t>
+      </w:r>
+      <w:r>
+        <w:rPr>
+          <w:i/>
+        </w:rPr>
+        <w:t>P</w:t>
+      </w:r>
+      <w:r>
+        <w:rPr>
+          <w:i w:val="0"/>
+        </w:rPr>
+        <w:t>(</w:t>
+      </w:r>
+      <w:r>
+        <w:rPr>
+          <w:i/>
+        </w:rPr>
+        <w:t>W</w:t>
+      </w:r>
+      <w:r>
+        <w:rPr>
+          <w:i w:val="0"/>
+        </w:rPr>
+        <w:t xml:space="preserve">) und </w:t>
+      </w:r>
+      <w:r>
+        <w:rPr>
+          <w:i/>
+        </w:rPr>
+        <w:t>P</w:t>
+      </w:r>
+      <w:r>
+        <w:rPr>
+          <w:i w:val="0"/>
+        </w:rPr>
+        <w:t>(</w:t>
+      </w:r>
+      <w:r>
+        <w:rPr>
+          <w:i/>
+        </w:rPr>
+        <w:t>Z</w:t>
+      </w:r>
+      <w:r>
+        <w:rPr>
+          <w:i w:val="0"/>
+        </w:rPr>
+        <w:t xml:space="preserve"> ∩ </w:t>
+      </w:r>
+      <w:r>
+        <w:rPr>
+          <w:i/>
+        </w:rPr>
+        <w:t>W</w:t>
+      </w:r>
+      <w:r>
+        <w:rPr>
+          <w:i w:val="0"/>
+        </w:rPr>
+        <w:t>) braucht es jedoch absolute Häufigkeiten.</w:t>
       </w:r>
     </w:p>
     <w:p>
@@ -823,7 +2065,10 @@
         <w:t xml:space="preserve">Woher kommen die Anzahlen? </w:t>
       </w:r>
       <w:r>
-        <w:t>Ein Rückrechnen aus den gerundeten Prozenten ist ungenau (z. B. 26 statt 25 Bewerberinnen in Fachbereich B). Deshalb übernehmen wir die Anzahlen aus dem Originaldatensatz (Bickel et al., 1975; in R als UCBAdmissions verfügbar: 1 835 Bewerbungen von Frauen, 2 691 von Männern). Der Code prüft, dass diese Anzahlen alle 24 Prozentwerte aus Tabelle 4 innerhalb der Rundungsgenauigkeit reproduzieren (Ergebnis: 0 Abweichungen).</w:t>
+        <w:rPr>
+          <w:i w:val="0"/>
+        </w:rPr>
+        <w:t>Ein Rückrechnen aus den gerundeten Prozenten ist ungenau (z. B. 26 statt 25 Bewerbungen von Frauen in Fachbereich B). Wir übernehmen deshalb die Anzahlen des Originaldatensatzes, der in R als UCBAdmissions verfügbar ist (R Core Team, o. J.; Bickel et al., 1975): 1 835 Bewerbungen von Frauen und 2 691 von Männern. Der Code prüft, dass diese Anzahlen alle 24 Prozentwerte aus Tabelle 4 innerhalb der Rundungsgenauigkeit reproduzieren. Ergebnis: 0 Abweichungen.</w:t>
       </w:r>
     </w:p>
     <w:p>
@@ -837,7 +2082,10 @@
         <w:t xml:space="preserve">Welche Datenstruktur? </w:t>
       </w:r>
       <w:r>
-        <w:t>Ein «langes» pandas-DataFrame mit einer Zeile je Fachbereich × Geschlecht × Entscheid und der Spalte Anzahl. Aus dieser Struktur lässt sich jede benötigte Kreuztabelle mit pivot_table erzeugen, gesamthaft oder für einen einzelnen Fachbereich.</w:t>
+        <w:rPr>
+          <w:i w:val="0"/>
+        </w:rPr>
+        <w:t>Ein «langes» pandas-DataFrame mit einer Zeile je Fachbereich × Geschlecht × Entscheid und der Spalte Anzahl. Daraus lässt sich jede Kreuztabelle mit pivot_table erzeugen, für alle Fachbereiche zusammen oder für einen einzelnen.</w:t>
       </w:r>
     </w:p>
     <w:p>
@@ -848,10 +2096,13 @@
         <w:rPr>
           <w:b/>
         </w:rPr>
-        <w:t xml:space="preserve">Was wird wiederholt? </w:t>
-      </w:r>
-      <w:r>
-        <w:t>Vierfeldertafel bilden, Unabhängigkeit prüfen und gruppierte Balkendiagramme zeichnen; jeweils einmal gesamthaft und sechsmal je Fachbereich. Diese Schritte werden deshalb als Funktionen umgesetzt (vgl. Kapitel 2).</w:t>
+        <w:t xml:space="preserve">Was wiederholt sich? </w:t>
+      </w:r>
+      <w:r>
+        <w:rPr>
+          <w:i w:val="0"/>
+        </w:rPr>
+        <w:t>Kreuztabelle bilden, Unabhängigkeit prüfen und gruppierte Säulendiagramme zeichnen, jeweils einmal gesamthaft und sechsmal je Fachbereich. Diese Schritte sind deshalb als Funktionen umgesetzt (vgl. Kapitel 2).</w:t>
       </w:r>
     </w:p>
     <w:p>
@@ -865,7 +2116,22 @@
         <w:t xml:space="preserve">Wie wird dargestellt? </w:t>
       </w:r>
       <w:r>
-        <w:t>Balkendiagramme mit Nullachse, weil Längen am genauesten verglichen werden können; eine feste Farbe je Geschlecht in allen Abbildungen; direkte Beschriftung der Werte; ein Streudiagramm für den Zusammenhang zweier Grössen je Fachbereich.</w:t>
+        <w:rPr>
+          <w:i w:val="0"/>
+        </w:rPr>
+        <w:t>Wie im Kurs: Säulendiagramme für kategoriale Daten, weil die Säulenhöhe proportional zur relativen Häufigkeit ist; gruppierte Säulendiagramme für Kreuztabellen; ein Streudiagramm für zwei metrische Grössen (Schnauss, o. J.-a, Folien 16, 42, 45). Jedes Geschlecht hat in allen Abbildungen dieselbe Farbe, die Werte stehen direkt an den Säulen.</w:t>
+      </w:r>
+    </w:p>
+    <w:p>
+      <w:pPr>
+        <w:keepNext/>
+        <w:spacing w:after="0"/>
+      </w:pPr>
+      <w:r>
+        <w:rPr>
+          <w:b/>
+        </w:rPr>
+        <w:t>Tabelle 1</w:t>
       </w:r>
     </w:p>
     <w:p>
@@ -874,26 +2140,27 @@
       </w:pPr>
       <w:r>
         <w:rPr>
-          <w:i w:val="0"/>
-        </w:rPr>
-        <w:t>Begründung der verwendeten Libraries:</w:t>
+          <w:i/>
+        </w:rPr>
+        <w:t>Verwendete Libraries und Begründung</w:t>
       </w:r>
     </w:p>
     <w:tbl>
       <w:tblPr>
         <w:tblStyle w:val="LightGrid-Accent1"/>
         <w:tblW w:type="auto" w:w="0"/>
+        <w:tblLayout w:type="fixed"/>
         <w:tblLook w:firstColumn="1" w:firstRow="1" w:lastColumn="0" w:lastRow="0" w:noHBand="0" w:noVBand="1" w:val="04A0"/>
       </w:tblPr>
       <w:tblGrid>
-        <w:gridCol w:w="3135"/>
-        <w:gridCol w:w="3135"/>
-        <w:gridCol w:w="3135"/>
+        <w:gridCol w:w="1474"/>
+        <w:gridCol w:w="2494"/>
+        <w:gridCol w:w="5102"/>
       </w:tblGrid>
       <w:tr>
         <w:tc>
           <w:tcPr>
-            <w:tcW w:type="dxa" w:w="3135"/>
+            <w:tcW w:type="dxa" w:w="1474"/>
           </w:tcPr>
           <w:p>
             <w:pPr>
@@ -909,7 +2176,7 @@
         </w:tc>
         <w:tc>
           <w:tcPr>
-            <w:tcW w:type="dxa" w:w="3135"/>
+            <w:tcW w:type="dxa" w:w="2494"/>
           </w:tcPr>
           <w:p>
             <w:pPr>
@@ -925,7 +2192,7 @@
         </w:tc>
         <w:tc>
           <w:tcPr>
-            <w:tcW w:type="dxa" w:w="3135"/>
+            <w:tcW w:type="dxa" w:w="5102"/>
           </w:tcPr>
           <w:p>
             <w:pPr>
@@ -943,7 +2210,7 @@
       <w:tr>
         <w:tc>
           <w:tcPr>
-            <w:tcW w:type="dxa" w:w="3135"/>
+            <w:tcW w:type="dxa" w:w="1474"/>
           </w:tcPr>
           <w:p>
             <w:pPr>
@@ -959,7 +2226,7 @@
         </w:tc>
         <w:tc>
           <w:tcPr>
-            <w:tcW w:type="dxa" w:w="3135"/>
+            <w:tcW w:type="dxa" w:w="2494"/>
           </w:tcPr>
           <w:p>
             <w:pPr>
@@ -975,7 +2242,7 @@
         </w:tc>
         <w:tc>
           <w:tcPr>
-            <w:tcW w:type="dxa" w:w="3135"/>
+            <w:tcW w:type="dxa" w:w="5102"/>
           </w:tcPr>
           <w:p>
             <w:pPr>
@@ -985,7 +2252,7 @@
               <w:rPr>
                 <w:sz w:val="19"/>
               </w:rPr>
-              <w:t>Standardwerkzeug für Tabellendaten (McKinney ist Autor von pandas); Kreuztabellen in einer Zeile</w:t>
+              <w:t>Standardwerkzeug für Tabellendaten in Python (McKinney, 2018); Kreuztabellen in einer Zeile</w:t>
             </w:r>
           </w:p>
         </w:tc>
@@ -993,7 +2260,7 @@
       <w:tr>
         <w:tc>
           <w:tcPr>
-            <w:tcW w:type="dxa" w:w="3135"/>
+            <w:tcW w:type="dxa" w:w="1474"/>
           </w:tcPr>
           <w:p>
             <w:pPr>
@@ -1009,7 +2276,7 @@
         </w:tc>
         <w:tc>
           <w:tcPr>
-            <w:tcW w:type="dxa" w:w="3135"/>
+            <w:tcW w:type="dxa" w:w="2494"/>
           </w:tcPr>
           <w:p>
             <w:pPr>
@@ -1019,13 +2286,13 @@
               <w:rPr>
                 <w:sz w:val="19"/>
               </w:rPr>
-              <w:t>Vektorrechnung, Korrelation</w:t>
+              <w:t>Rechnen auf Spalten, Korrelation</w:t>
             </w:r>
           </w:p>
         </w:tc>
         <w:tc>
           <w:tcPr>
-            <w:tcW w:type="dxa" w:w="3135"/>
+            <w:tcW w:type="dxa" w:w="5102"/>
           </w:tcPr>
           <w:p>
             <w:pPr>
@@ -1035,7 +2302,7 @@
               <w:rPr>
                 <w:sz w:val="19"/>
               </w:rPr>
-              <w:t>Basis von pandas; rechnet auf ganzen Spalten ohne Schleifen</w:t>
+              <w:t>Grundlage von pandas; keine Schleifen für einfache Rechnungen nötig</w:t>
             </w:r>
           </w:p>
         </w:tc>
@@ -1043,7 +2310,7 @@
       <w:tr>
         <w:tc>
           <w:tcPr>
-            <w:tcW w:type="dxa" w:w="3135"/>
+            <w:tcW w:type="dxa" w:w="1474"/>
           </w:tcPr>
           <w:p>
             <w:pPr>
@@ -1059,7 +2326,7 @@
         </w:tc>
         <w:tc>
           <w:tcPr>
-            <w:tcW w:type="dxa" w:w="3135"/>
+            <w:tcW w:type="dxa" w:w="2494"/>
           </w:tcPr>
           <w:p>
             <w:pPr>
@@ -1075,7 +2342,7 @@
         </w:tc>
         <w:tc>
           <w:tcPr>
-            <w:tcW w:type="dxa" w:w="3135"/>
+            <w:tcW w:type="dxa" w:w="5102"/>
           </w:tcPr>
           <w:p>
             <w:pPr>
@@ -1085,7 +2352,7 @@
               <w:rPr>
                 <w:sz w:val="19"/>
               </w:rPr>
-              <w:t>In Anaconda enthalten; volle Kontrolle über Farben, Beschriftungen und PNG-Export</w:t>
+              <w:t>Volle Kontrolle über Farben, Beschriftungen und den PNG-Export für Ausarbeitung und Folien</w:t>
             </w:r>
           </w:p>
         </w:tc>
@@ -1093,61 +2360,11 @@
       <w:tr>
         <w:tc>
           <w:tcPr>
-            <w:tcW w:type="dxa" w:w="3135"/>
+            <w:tcW w:type="dxa" w:w="1474"/>
           </w:tcPr>
           <w:p>
             <w:pPr>
               <w:keepNext/>
-            </w:pPr>
-            <w:r>
-              <w:rPr>
-                <w:sz w:val="19"/>
-              </w:rPr>
-              <w:t>scipy.stats</w:t>
-            </w:r>
-          </w:p>
-        </w:tc>
-        <w:tc>
-          <w:tcPr>
-            <w:tcW w:type="dxa" w:w="3135"/>
-          </w:tcPr>
-          <w:p>
-            <w:pPr>
-              <w:keepNext/>
-            </w:pPr>
-            <w:r>
-              <w:rPr>
-                <w:sz w:val="19"/>
-              </w:rPr>
-              <w:t>chi2_contingency</w:t>
-            </w:r>
-          </w:p>
-        </w:tc>
-        <w:tc>
-          <w:tcPr>
-            <w:tcW w:type="dxa" w:w="3135"/>
-          </w:tcPr>
-          <w:p>
-            <w:pPr>
-              <w:keepNext/>
-            </w:pPr>
-            <w:r>
-              <w:rPr>
-                <w:sz w:val="19"/>
-              </w:rPr>
-              <w:t>Geprüfte Implementierung des Chi-Quadrat-Tests, liefert Statistik, p-Wert und erwartete Häufigkeiten</w:t>
-            </w:r>
-          </w:p>
-        </w:tc>
-      </w:tr>
-      <w:tr>
-        <w:tc>
-          <w:tcPr>
-            <w:tcW w:type="dxa" w:w="3135"/>
-          </w:tcPr>
-          <w:p>
-            <w:pPr>
-              <w:keepNext w:val="0"/>
             </w:pPr>
             <w:r>
               <w:rPr>
@@ -1159,11 +2376,11 @@
         </w:tc>
         <w:tc>
           <w:tcPr>
-            <w:tcW w:type="dxa" w:w="3135"/>
+            <w:tcW w:type="dxa" w:w="2494"/>
           </w:tcPr>
           <w:p>
             <w:pPr>
-              <w:keepNext w:val="0"/>
+              <w:keepNext/>
             </w:pPr>
             <w:r>
               <w:rPr>
@@ -1175,23 +2392,40 @@
         </w:tc>
         <w:tc>
           <w:tcPr>
-            <w:tcW w:type="dxa" w:w="3135"/>
+            <w:tcW w:type="dxa" w:w="5102"/>
           </w:tcPr>
           <w:p>
             <w:pPr>
-              <w:keepNext w:val="0"/>
+              <w:keepNext/>
             </w:pPr>
             <w:r>
               <w:rPr>
                 <w:sz w:val="19"/>
               </w:rPr>
-              <w:t>Standardbibliothek, keine Installation nötig; direkt aus McKinney 3.2</w:t>
+              <w:t>Standardbibliothek, keine Installation nötig; direkt aus McKinney (2018, S. 74, 77)</w:t>
             </w:r>
           </w:p>
         </w:tc>
       </w:tr>
     </w:tbl>
-    <w:p/>
+    <w:p>
+      <w:pPr>
+        <w:spacing w:after="240"/>
+      </w:pPr>
+      <w:r>
+        <w:rPr>
+          <w:i/>
+          <w:sz w:val="19"/>
+        </w:rPr>
+        <w:t xml:space="preserve">Anmerkung. </w:t>
+      </w:r>
+      <w:r>
+        <w:rPr>
+          <w:sz w:val="19"/>
+        </w:rPr>
+        <w:t>Der Kurs arbeitet mit Anaconda und Jupyter (ZHAW SML, 2019); pandas, NumPy und Matplotlib sind darin bereits enthalten.</w:t>
+      </w:r>
+    </w:p>
     <w:p>
       <w:pPr>
         <w:pStyle w:val="Heading1"/>
@@ -1201,11 +2435,37 @@
       </w:r>
     </w:p>
     <w:p>
+      <w:pPr>
+        <w:keepNext w:val="0"/>
+      </w:pPr>
       <w:r>
         <w:rPr>
           <w:i w:val="0"/>
         </w:rPr>
-        <w:t>Damit ein Betrachter schnell auf eine Ungerechtigkeit schliessen kann, genügt ein einziger Vergleich: die Zulassungsquote aller Frauen gegenüber der aller Männer. Wir wählen ein Balkendiagramm mit zwei Balken, gemeinsamer Nullachse, direkter Wertbeschriftung und eingezeichneter Differenz (Abbildung 1). Weitere Details würden von dieser Kernaussage ablenken.</w:t>
+        <w:t>Damit ein Betrachter schnell auf eine Ungerechtigkeit schliessen kann, genügt ein einziger Vergleich: die Zulassungsquote aller Frauen gegenüber der aller Männer. Wir wählen ein Säulendiagramm mit zwei Säulen, sichtbarer Nullachse, direkter Wertbeschriftung und eingezeichneter Differenz (Abbildung 1). Weitere Details würden von dieser Kernaussage ablenken.</w:t>
+      </w:r>
+    </w:p>
+    <w:p>
+      <w:pPr>
+        <w:keepNext/>
+        <w:spacing w:after="0"/>
+      </w:pPr>
+      <w:r>
+        <w:rPr>
+          <w:b/>
+        </w:rPr>
+        <w:t>Abbildung 1</w:t>
+      </w:r>
+    </w:p>
+    <w:p>
+      <w:pPr>
+        <w:keepNext/>
+      </w:pPr>
+      <w:r>
+        <w:rPr>
+          <w:i/>
+        </w:rPr>
+        <w:t>Zulassungsquote nach Geschlecht über alle sechs Fachbereiche</w:t>
       </w:r>
     </w:p>
     <w:p>
@@ -1216,7 +2476,7 @@
       <w:r>
         <w:drawing>
           <wp:inline xmlns:a="http://schemas.openxmlformats.org/drawingml/2006/main" xmlns:pic="http://schemas.openxmlformats.org/drawingml/2006/picture">
-            <wp:extent cx="4320000" cy="3024000"/>
+            <wp:extent cx="4140000" cy="2898000"/>
             <wp:docPr id="1" name="Picture 1"/>
             <wp:cNvGraphicFramePr>
               <a:graphicFrameLocks noChangeAspect="1"/>
@@ -1237,7 +2497,7 @@
                   <pic:spPr>
                     <a:xfrm>
                       <a:off x="0" y="0"/>
-                      <a:ext cx="4320000" cy="3024000"/>
+                      <a:ext cx="4140000" cy="2898000"/>
                     </a:xfrm>
                     <a:prstGeom prst="rect"/>
                   </pic:spPr>
@@ -1250,22 +2510,31 @@
     </w:p>
     <w:p>
       <w:pPr>
-        <w:jc w:val="center"/>
+        <w:spacing w:after="240"/>
       </w:pPr>
       <w:r>
         <w:rPr>
           <w:i/>
           <w:sz w:val="19"/>
         </w:rPr>
-        <w:t>Abbildung 1: Zulassungsquote nach Geschlecht über alle sechs Fachbereiche</w:t>
+        <w:t xml:space="preserve">Anmerkung. </w:t>
+      </w:r>
+      <w:r>
+        <w:rPr>
+          <w:sz w:val="19"/>
+        </w:rPr>
+        <w:t>Eigene Darstellung. Daten aus Bickel et al. (1975), bereitgestellt als R-Datensatz UCBAdmissions (R Core Team, o. J.).</w:t>
       </w:r>
     </w:p>
     <w:p>
+      <w:pPr>
+        <w:keepNext w:val="0"/>
+      </w:pPr>
       <w:r>
         <w:rPr>
           <w:i w:val="0"/>
         </w:rPr>
-        <w:t>Männer wurden zu 44.5 % zugelassen, Frauen nur zu 30.4 %. Die Differenz beträgt 14.2 Prozentpunkte, die Quote der Männer ist rund 1.47-mal so hoch. Wären die 1 835 Bewerberinnen mit der Quote der Männer zugelassen worden, hätten 817 statt 557 Frauen einen Studienplatz erhalten. Auf den ersten Blick ist das ein deutliches Indiz für eine Benachteiligung von Frauen.</w:t>
+        <w:t>Männer wurden zu 44.5 % zugelassen, Frauen nur zu 30.4 %. Der Unterschied beträgt 14.2 Prozentpunkte (exakt 44.52 % − 30.35 %), die Quote der Männer ist rund 1.47-mal so hoch. Wären die 1 835 Bewerberinnen mit der Quote der Männer zugelassen worden, hätten 817 statt 557 Frauen einen Studienplatz erhalten. Auf den ersten Blick spricht das deutlich für eine Benachteiligung von Frauen.</w:t>
       </w:r>
     </w:p>
     <w:p>
@@ -1282,6 +2551,40 @@
       </w:pPr>
       <w:r>
         <w:t>6.1  Zulassungsquoten innerhalb der Fachbereiche</w:t>
+      </w:r>
+    </w:p>
+    <w:p>
+      <w:pPr>
+        <w:keepNext w:val="0"/>
+      </w:pPr>
+      <w:r>
+        <w:rPr>
+          <w:i w:val="0"/>
+        </w:rPr>
+        <w:t>Innerhalb der Fachbereiche zeigt sich ein anderes Bild (Abbildung 2). In vier von sechs Fachbereichen (A, B, D, F) haben Frauen die höhere Zulassungsquote, in A sogar um 20.3 Prozentpunkte. In C und E liegen die Männer mit 2.9 bzw. 3.8 Prozentpunkten leicht vorne. Eine systematische Benachteiligung von Frauen ist auf Ebene der Fachbereiche, die über die Zulassung entscheiden, nicht erkennbar.</w:t>
+      </w:r>
+    </w:p>
+    <w:p>
+      <w:pPr>
+        <w:keepNext/>
+        <w:spacing w:after="0"/>
+      </w:pPr>
+      <w:r>
+        <w:rPr>
+          <w:b/>
+        </w:rPr>
+        <w:t>Abbildung 2</w:t>
+      </w:r>
+    </w:p>
+    <w:p>
+      <w:pPr>
+        <w:keepNext/>
+      </w:pPr>
+      <w:r>
+        <w:rPr>
+          <w:i/>
+        </w:rPr>
+        <w:t>Zulassungsquote je Fachbereich und Geschlecht (in %)</w:t>
       </w:r>
     </w:p>
     <w:p>
@@ -1326,22 +2629,20 @@
     </w:p>
     <w:p>
       <w:pPr>
-        <w:jc w:val="center"/>
+        <w:spacing w:after="240"/>
       </w:pPr>
       <w:r>
         <w:rPr>
           <w:i/>
           <w:sz w:val="19"/>
         </w:rPr>
-        <w:t>Abbildung 2: Zulassungsquote je Fachbereich und Geschlecht (in %)</w:t>
-      </w:r>
-    </w:p>
-    <w:p>
-      <w:r>
-        <w:rPr>
-          <w:i w:val="0"/>
-        </w:rPr>
-        <w:t>Innerhalb der Fachbereiche zeigt sich ein anderes Bild (Abbildung 2): In vier von sechs Fachbereichen (A, B, D, F) haben Frauen die höhere Zulassungsquote, in A sogar um 20.3 Prozentpunkte. In C und E liegen die Männer mit 2.8 bzw. 3.8 Prozentpunkten leicht vorne. Eine systematische Benachteiligung von Frauen ist auf Ebene der Fachbereiche, die über die Zulassung entscheiden, nicht erkennbar.</w:t>
+        <w:t xml:space="preserve">Anmerkung. </w:t>
+      </w:r>
+      <w:r>
+        <w:rPr>
+          <w:sz w:val="19"/>
+        </w:rPr>
+        <w:t>Eigene Darstellung. Daten aus Tabelle 4 der Aufgabenstellung (ZHAW SML, 2026).</w:t>
       </w:r>
     </w:p>
     <w:p>
@@ -1350,6 +2651,40 @@
       </w:pPr>
       <w:r>
         <w:t>6.2  Verteilung der Bewerbungen auf die Fachbereiche</w:t>
+      </w:r>
+    </w:p>
+    <w:p>
+      <w:pPr>
+        <w:keepNext w:val="0"/>
+      </w:pPr>
+      <w:r>
+        <w:rPr>
+          <w:i w:val="0"/>
+        </w:rPr>
+        <w:t>Die beiden Geschlechter verteilen sich sehr unterschiedlich auf die Fachbereiche (Abbildung 3). 51.5 % der Männer bewarben sich in A oder B, wo rund zwei Drittel der Bewerbungen erfolgreich sind. Von den Frauen taten dies nur 7.2 %; 92.8 % bewarben sich in C bis F, wo die Quoten zwischen 6 % und 35 % liegen.</w:t>
+      </w:r>
+    </w:p>
+    <w:p>
+      <w:pPr>
+        <w:keepNext/>
+        <w:spacing w:after="0"/>
+      </w:pPr>
+      <w:r>
+        <w:rPr>
+          <w:b/>
+        </w:rPr>
+        <w:t>Abbildung 3</w:t>
+      </w:r>
+    </w:p>
+    <w:p>
+      <w:pPr>
+        <w:keepNext/>
+      </w:pPr>
+      <w:r>
+        <w:rPr>
+          <w:i/>
+        </w:rPr>
+        <w:t>Anteil der Bewerbungen je Fachbereich, getrennt nach Geschlecht (in %)</w:t>
       </w:r>
     </w:p>
     <w:p>
@@ -1394,22 +2729,54 @@
     </w:p>
     <w:p>
       <w:pPr>
-        <w:jc w:val="center"/>
+        <w:spacing w:after="240"/>
       </w:pPr>
       <w:r>
         <w:rPr>
           <w:i/>
           <w:sz w:val="19"/>
         </w:rPr>
-        <w:t>Abbildung 3: Anteil der Bewerbungen je Fachbereich, getrennt nach Geschlecht (in %)</w:t>
+        <w:t xml:space="preserve">Anmerkung. </w:t>
+      </w:r>
+      <w:r>
+        <w:rPr>
+          <w:sz w:val="19"/>
+        </w:rPr>
+        <w:t>Eigene Darstellung. Daten aus Tabelle 4 der Aufgabenstellung (ZHAW SML, 2026).</w:t>
       </w:r>
     </w:p>
     <w:p>
+      <w:pPr>
+        <w:keepNext w:val="0"/>
+      </w:pPr>
       <w:r>
         <w:rPr>
           <w:i w:val="0"/>
         </w:rPr>
-        <w:t>Die beiden Geschlechter verteilen sich sehr unterschiedlich auf die Fachbereiche (Abbildung 3). 51.5 % der Männer bewarben sich in A oder B, wo rund zwei Drittel aller Bewerbungen erfolgreich sind. Von den Frauen taten dies nur 7.2 %; 92.8 % bewarben sich in C bis F, wo die Quoten zwischen 6 % und 35 % liegen. Abbildung 4 fasst dies je Fachbereich zusammen: Je höher der Frauenanteil unter den Bewerbungen, desto tiefer die Zulassungsquote des Fachbereichs (Korrelation r = −0.79).</w:t>
+        <w:t>Abbildung 4 fasst beides je Fachbereich zusammen: Je höher der Frauenanteil unter den Bewerbungen, desto tiefer die Zulassungsquote des Fachbereichs (Korrelation r = −0.79).</w:t>
+      </w:r>
+    </w:p>
+    <w:p>
+      <w:pPr>
+        <w:keepNext/>
+        <w:spacing w:after="0"/>
+      </w:pPr>
+      <w:r>
+        <w:rPr>
+          <w:b/>
+        </w:rPr>
+        <w:t>Abbildung 4</w:t>
+      </w:r>
+    </w:p>
+    <w:p>
+      <w:pPr>
+        <w:keepNext/>
+      </w:pPr>
+      <w:r>
+        <w:rPr>
+          <w:i/>
+        </w:rPr>
+        <w:t>Frauenanteil und Zulassungsquote je Fachbereich</w:t>
       </w:r>
     </w:p>
     <w:p>
@@ -1454,14 +2821,20 @@
     </w:p>
     <w:p>
       <w:pPr>
-        <w:jc w:val="center"/>
+        <w:spacing w:after="240"/>
       </w:pPr>
       <w:r>
         <w:rPr>
           <w:i/>
           <w:sz w:val="19"/>
         </w:rPr>
-        <w:t>Abbildung 4: Frauenanteil und Zulassungsquote je Fachbereich (Punktfläche proportional zur Anzahl Bewerbungen)</w:t>
+        <w:t xml:space="preserve">Anmerkung. </w:t>
+      </w:r>
+      <w:r>
+        <w:rPr>
+          <w:sz w:val="19"/>
+        </w:rPr>
+        <w:t>Eigene Darstellung. Die Punktfläche ist proportional zur Anzahl Bewerbungen. Daten aus Bickel et al. (1975) bzw. R Core Team (o. J.).</w:t>
       </w:r>
     </w:p>
     <w:p>
@@ -1473,11 +2846,37 @@
       </w:r>
     </w:p>
     <w:p>
+      <w:pPr>
+        <w:keepNext w:val="0"/>
+      </w:pPr>
       <w:r>
         <w:rPr>
           <w:i w:val="0"/>
         </w:rPr>
-        <w:t>Nach Abschnitt 3.2 ist die Gesamtquote ein gewichteter Mittelwert der Fachbereichsquoten. Die Frauen erhalten ihre hohen Gewichte bei den tiefen Quoten, die Männer bei den hohen. Um den Effekt der Fachbereichswahl zu isolieren, setzen wir für beide Geschlechter dieselben Gewichte ein, nämlich die Verteilung aller 4 526 Bewerbungen auf die Fachbereiche (Standardisierung). Technisch ist das derselbe Aufruf der Funktion gesamtquote, nur mit anderen Gewichten. Ergebnis (Abbildung 5): Bei gleicher Fachbereichswahl läge die Quote der Frauen bei 43.0 % und die der Männer bei 38.7 %. Der Unterschied kehrt sich also um.</w:t>
+        <w:t>Nach Abschnitt 3.3 ist die Gesamtquote ein gewichteter Mittelwert der Fachbereichsquoten. Die Frauen haben ihre grossen Gewichte bei den tiefen Quoten, die Männer bei den hohen. Um den Einfluss der Fachbereichswahl auszuschalten, setzen wir für beide Geschlechter dieselben Gewichte ein, nämlich die Verteilung aller 4 526 Bewerbungen auf die Fachbereiche. Technisch ist das derselbe Aufruf der Funktion gesamtquote, nur mit anderen Gewichten. Ergebnis (Abbildung 5): Bei gleicher Fachbereichswahl läge die Quote der Frauen bei 43.0 % und die der Männer bei 38.7 %. Der Unterschied kehrt sich also um.</w:t>
+      </w:r>
+    </w:p>
+    <w:p>
+      <w:pPr>
+        <w:keepNext/>
+        <w:spacing w:after="0"/>
+      </w:pPr>
+      <w:r>
+        <w:rPr>
+          <w:b/>
+        </w:rPr>
+        <w:t>Abbildung 5</w:t>
+      </w:r>
+    </w:p>
+    <w:p>
+      <w:pPr>
+        <w:keepNext/>
+      </w:pPr>
+      <w:r>
+        <w:rPr>
+          <w:i/>
+        </w:rPr>
+        <w:t>Tatsächliche und standardisierte Zulassungsquoten</w:t>
       </w:r>
     </w:p>
     <w:p>
@@ -1488,7 +2887,7 @@
       <w:r>
         <w:drawing>
           <wp:inline xmlns:a="http://schemas.openxmlformats.org/drawingml/2006/main" xmlns:pic="http://schemas.openxmlformats.org/drawingml/2006/picture">
-            <wp:extent cx="4320000" cy="2592000"/>
+            <wp:extent cx="4140000" cy="2484000"/>
             <wp:docPr id="5" name="Picture 5"/>
             <wp:cNvGraphicFramePr>
               <a:graphicFrameLocks noChangeAspect="1"/>
@@ -1509,7 +2908,7 @@
                   <pic:spPr>
                     <a:xfrm>
                       <a:off x="0" y="0"/>
-                      <a:ext cx="4320000" cy="2592000"/>
+                      <a:ext cx="4140000" cy="2484000"/>
                     </a:xfrm>
                     <a:prstGeom prst="rect"/>
                   </pic:spPr>
@@ -1522,14 +2921,20 @@
     </w:p>
     <w:p>
       <w:pPr>
-        <w:jc w:val="center"/>
+        <w:spacing w:after="240"/>
       </w:pPr>
       <w:r>
         <w:rPr>
           <w:i/>
           <w:sz w:val="19"/>
         </w:rPr>
-        <w:t>Abbildung 5: Tatsächliche und standardisierte Zulassungsquoten</w:t>
+        <w:t xml:space="preserve">Anmerkung. </w:t>
+      </w:r>
+      <w:r>
+        <w:rPr>
+          <w:sz w:val="19"/>
+        </w:rPr>
+        <w:t>Eigene Darstellung und Berechnung. «Bei gleicher Fachbereichswahl»: Fachbereichsquoten beider Geschlechter gewichtet mit der Verteilung aller Bewerbungen. Daten aus Bickel et al. (1975) bzw. R Core Team (o. J.).</w:t>
       </w:r>
     </w:p>
     <w:p>
@@ -1543,30 +2948,43 @@
     <w:p>
       <w:pPr>
         <w:keepNext/>
+        <w:spacing w:after="0"/>
       </w:pPr>
       <w:r>
         <w:rPr>
-          <w:i w:val="0"/>
-        </w:rPr>
-        <w:t>Über alle Fachbereiche ergibt sich folgende Vierfeldertafel:</w:t>
+          <w:b/>
+        </w:rPr>
+        <w:t>Tabelle 2</w:t>
+      </w:r>
+    </w:p>
+    <w:p>
+      <w:pPr>
+        <w:keepNext/>
+      </w:pPr>
+      <w:r>
+        <w:rPr>
+          <w:i/>
+        </w:rPr>
+        <w:t>Kreuztabelle der Bewerbungen über alle sechs Fachbereiche</w:t>
       </w:r>
     </w:p>
     <w:tbl>
       <w:tblPr>
         <w:tblStyle w:val="LightGrid-Accent1"/>
         <w:tblW w:type="auto" w:w="0"/>
+        <w:tblLayout w:type="fixed"/>
         <w:tblLook w:firstColumn="1" w:firstRow="1" w:lastColumn="0" w:lastRow="0" w:noHBand="0" w:noVBand="1" w:val="04A0"/>
       </w:tblPr>
       <w:tblGrid>
-        <w:gridCol w:w="2351"/>
-        <w:gridCol w:w="2351"/>
-        <w:gridCol w:w="2351"/>
-        <w:gridCol w:w="2351"/>
+        <w:gridCol w:w="1928"/>
+        <w:gridCol w:w="2381"/>
+        <w:gridCol w:w="2381"/>
+        <w:gridCol w:w="2381"/>
       </w:tblGrid>
       <w:tr>
         <w:tc>
           <w:tcPr>
-            <w:tcW w:type="dxa" w:w="2351"/>
+            <w:tcW w:type="dxa" w:w="1928"/>
           </w:tcPr>
           <w:p>
             <w:pPr>
@@ -1581,7 +2999,7 @@
         </w:tc>
         <w:tc>
           <w:tcPr>
-            <w:tcW w:type="dxa" w:w="2351"/>
+            <w:tcW w:type="dxa" w:w="2381"/>
           </w:tcPr>
           <w:p>
             <w:pPr>
@@ -1597,7 +3015,7 @@
         </w:tc>
         <w:tc>
           <w:tcPr>
-            <w:tcW w:type="dxa" w:w="2351"/>
+            <w:tcW w:type="dxa" w:w="2381"/>
           </w:tcPr>
           <w:p>
             <w:pPr>
@@ -1613,7 +3031,7 @@
         </w:tc>
         <w:tc>
           <w:tcPr>
-            <w:tcW w:type="dxa" w:w="2351"/>
+            <w:tcW w:type="dxa" w:w="2381"/>
           </w:tcPr>
           <w:p>
             <w:pPr>
@@ -1631,7 +3049,7 @@
       <w:tr>
         <w:tc>
           <w:tcPr>
-            <w:tcW w:type="dxa" w:w="2351"/>
+            <w:tcW w:type="dxa" w:w="1928"/>
           </w:tcPr>
           <w:p>
             <w:pPr>
@@ -1647,7 +3065,7 @@
         </w:tc>
         <w:tc>
           <w:tcPr>
-            <w:tcW w:type="dxa" w:w="2351"/>
+            <w:tcW w:type="dxa" w:w="2381"/>
           </w:tcPr>
           <w:p>
             <w:pPr>
@@ -1663,7 +3081,7 @@
         </w:tc>
         <w:tc>
           <w:tcPr>
-            <w:tcW w:type="dxa" w:w="2351"/>
+            <w:tcW w:type="dxa" w:w="2381"/>
           </w:tcPr>
           <w:p>
             <w:pPr>
@@ -1679,7 +3097,7 @@
         </w:tc>
         <w:tc>
           <w:tcPr>
-            <w:tcW w:type="dxa" w:w="2351"/>
+            <w:tcW w:type="dxa" w:w="2381"/>
           </w:tcPr>
           <w:p>
             <w:pPr>
@@ -1697,7 +3115,7 @@
       <w:tr>
         <w:tc>
           <w:tcPr>
-            <w:tcW w:type="dxa" w:w="2351"/>
+            <w:tcW w:type="dxa" w:w="1928"/>
           </w:tcPr>
           <w:p>
             <w:pPr>
@@ -1713,7 +3131,7 @@
         </w:tc>
         <w:tc>
           <w:tcPr>
-            <w:tcW w:type="dxa" w:w="2351"/>
+            <w:tcW w:type="dxa" w:w="2381"/>
           </w:tcPr>
           <w:p>
             <w:pPr>
@@ -1729,7 +3147,7 @@
         </w:tc>
         <w:tc>
           <w:tcPr>
-            <w:tcW w:type="dxa" w:w="2351"/>
+            <w:tcW w:type="dxa" w:w="2381"/>
           </w:tcPr>
           <w:p>
             <w:pPr>
@@ -1745,7 +3163,7 @@
         </w:tc>
         <w:tc>
           <w:tcPr>
-            <w:tcW w:type="dxa" w:w="2351"/>
+            <w:tcW w:type="dxa" w:w="2381"/>
           </w:tcPr>
           <w:p>
             <w:pPr>
@@ -1763,11 +3181,11 @@
       <w:tr>
         <w:tc>
           <w:tcPr>
-            <w:tcW w:type="dxa" w:w="2351"/>
+            <w:tcW w:type="dxa" w:w="1928"/>
           </w:tcPr>
           <w:p>
             <w:pPr>
-              <w:keepNext w:val="0"/>
+              <w:keepNext/>
             </w:pPr>
             <w:r>
               <w:rPr>
@@ -1779,11 +3197,11 @@
         </w:tc>
         <w:tc>
           <w:tcPr>
-            <w:tcW w:type="dxa" w:w="2351"/>
+            <w:tcW w:type="dxa" w:w="2381"/>
           </w:tcPr>
           <w:p>
             <w:pPr>
-              <w:keepNext w:val="0"/>
+              <w:keepNext/>
             </w:pPr>
             <w:r>
               <w:rPr>
@@ -1795,11 +3213,11 @@
         </w:tc>
         <w:tc>
           <w:tcPr>
-            <w:tcW w:type="dxa" w:w="2351"/>
+            <w:tcW w:type="dxa" w:w="2381"/>
           </w:tcPr>
           <w:p>
             <w:pPr>
-              <w:keepNext w:val="0"/>
+              <w:keepNext/>
             </w:pPr>
             <w:r>
               <w:rPr>
@@ -1811,11 +3229,11 @@
         </w:tc>
         <w:tc>
           <w:tcPr>
-            <w:tcW w:type="dxa" w:w="2351"/>
+            <w:tcW w:type="dxa" w:w="2381"/>
           </w:tcPr>
           <w:p>
             <w:pPr>
-              <w:keepNext w:val="0"/>
+              <w:keepNext/>
             </w:pPr>
             <w:r>
               <w:rPr>
@@ -1827,13 +3245,284 @@
         </w:tc>
       </w:tr>
     </w:tbl>
-    <w:p/>
     <w:p>
+      <w:pPr>
+        <w:spacing w:after="240"/>
+      </w:pPr>
+      <w:r>
+        <w:rPr>
+          <w:i/>
+          <w:sz w:val="19"/>
+        </w:rPr>
+        <w:t xml:space="preserve">Anmerkung. </w:t>
+      </w:r>
+      <w:r>
+        <w:rPr>
+          <w:sz w:val="19"/>
+        </w:rPr>
+        <w:t>Daten aus Bickel et al. (1975) bzw. R Core Team (o. J.).</w:t>
+      </w:r>
+    </w:p>
+    <w:p>
+      <w:pPr>
+        <w:keepNext w:val="0"/>
+      </w:pPr>
       <w:r>
         <w:rPr>
           <w:i w:val="0"/>
         </w:rPr>
-        <w:t>Daraus folgt P(Z) = 1 755 / 4 526 = 0.3878 und P(W) = 1 835 / 4 526 = 0.4054. Bei Unabhängigkeit müsste P(Z ∩ W) = P(Z) · P(W) = 0.1572 gelten. Beobachtet wird P(Z ∩ W) = 557 / 4 526 = 0.1231. Entsprechend ist P(Z | W) = 0.304 ≠ P(Z) = 0.388. Aggregiert sind Zulassung und Geschlecht also stochastisch abhängig. Der Chi-Quadrat-Test bestätigt, dass dies nicht zufällig ist (χ² = 92.2; df = 1; p &lt; 0.001).</w:t>
+        <w:t xml:space="preserve">Aus Tabelle 2 folgt </w:t>
+      </w:r>
+      <w:r>
+        <w:rPr>
+          <w:i/>
+        </w:rPr>
+        <w:t>P</w:t>
+      </w:r>
+      <w:r>
+        <w:rPr>
+          <w:i w:val="0"/>
+        </w:rPr>
+        <w:t>(</w:t>
+      </w:r>
+      <w:r>
+        <w:rPr>
+          <w:i/>
+        </w:rPr>
+        <w:t>Z</w:t>
+      </w:r>
+      <w:r>
+        <w:rPr>
+          <w:i w:val="0"/>
+        </w:rPr>
+        <w:t xml:space="preserve">) = 1 755 / 4 526 = 0.3878 und </w:t>
+      </w:r>
+      <w:r>
+        <w:rPr>
+          <w:i/>
+        </w:rPr>
+        <w:t>P</w:t>
+      </w:r>
+      <w:r>
+        <w:rPr>
+          <w:i w:val="0"/>
+        </w:rPr>
+        <w:t>(</w:t>
+      </w:r>
+      <w:r>
+        <w:rPr>
+          <w:i/>
+        </w:rPr>
+        <w:t>W</w:t>
+      </w:r>
+      <w:r>
+        <w:rPr>
+          <w:i w:val="0"/>
+        </w:rPr>
+        <w:t xml:space="preserve">) = 1 835 / 4 526 = 0.4054. Bei Unabhängigkeit müsste </w:t>
+      </w:r>
+      <w:r>
+        <w:rPr>
+          <w:i/>
+        </w:rPr>
+        <w:t>P</w:t>
+      </w:r>
+      <w:r>
+        <w:rPr>
+          <w:i w:val="0"/>
+        </w:rPr>
+        <w:t>(</w:t>
+      </w:r>
+      <w:r>
+        <w:rPr>
+          <w:i/>
+        </w:rPr>
+        <w:t>Z</w:t>
+      </w:r>
+      <w:r>
+        <w:rPr>
+          <w:i w:val="0"/>
+        </w:rPr>
+        <w:t xml:space="preserve"> ∩ </w:t>
+      </w:r>
+      <w:r>
+        <w:rPr>
+          <w:i/>
+        </w:rPr>
+        <w:t>W</w:t>
+      </w:r>
+      <w:r>
+        <w:rPr>
+          <w:i w:val="0"/>
+        </w:rPr>
+        <w:t xml:space="preserve">) = </w:t>
+      </w:r>
+      <w:r>
+        <w:rPr>
+          <w:i/>
+        </w:rPr>
+        <w:t>P</w:t>
+      </w:r>
+      <w:r>
+        <w:rPr>
+          <w:i w:val="0"/>
+        </w:rPr>
+        <w:t>(</w:t>
+      </w:r>
+      <w:r>
+        <w:rPr>
+          <w:i/>
+        </w:rPr>
+        <w:t>Z</w:t>
+      </w:r>
+      <w:r>
+        <w:rPr>
+          <w:i w:val="0"/>
+        </w:rPr>
+        <w:t xml:space="preserve">) · </w:t>
+      </w:r>
+      <w:r>
+        <w:rPr>
+          <w:i/>
+        </w:rPr>
+        <w:t>P</w:t>
+      </w:r>
+      <w:r>
+        <w:rPr>
+          <w:i w:val="0"/>
+        </w:rPr>
+        <w:t>(</w:t>
+      </w:r>
+      <w:r>
+        <w:rPr>
+          <w:i/>
+        </w:rPr>
+        <w:t>W</w:t>
+      </w:r>
+      <w:r>
+        <w:rPr>
+          <w:i w:val="0"/>
+        </w:rPr>
+        <w:t xml:space="preserve">) = 0.1572 gelten. Beobachtet wird jedoch </w:t>
+      </w:r>
+      <w:r>
+        <w:rPr>
+          <w:i/>
+        </w:rPr>
+        <w:t>P</w:t>
+      </w:r>
+      <w:r>
+        <w:rPr>
+          <w:i w:val="0"/>
+        </w:rPr>
+        <w:t>(</w:t>
+      </w:r>
+      <w:r>
+        <w:rPr>
+          <w:i/>
+        </w:rPr>
+        <w:t>Z</w:t>
+      </w:r>
+      <w:r>
+        <w:rPr>
+          <w:i w:val="0"/>
+        </w:rPr>
+        <w:t xml:space="preserve"> ∩ </w:t>
+      </w:r>
+      <w:r>
+        <w:rPr>
+          <w:i/>
+        </w:rPr>
+        <w:t>W</w:t>
+      </w:r>
+      <w:r>
+        <w:rPr>
+          <w:i w:val="0"/>
+        </w:rPr>
+        <w:t xml:space="preserve">) = 557 / 4 526 = 0.1231, also rund 22 % weniger. Entsprechend ist </w:t>
+      </w:r>
+      <w:r>
+        <w:rPr>
+          <w:i/>
+        </w:rPr>
+        <w:t>P</w:t>
+      </w:r>
+      <w:r>
+        <w:rPr>
+          <w:i w:val="0"/>
+        </w:rPr>
+        <w:t>(</w:t>
+      </w:r>
+      <w:r>
+        <w:rPr>
+          <w:i/>
+        </w:rPr>
+        <w:t>Z</w:t>
+      </w:r>
+      <w:r>
+        <w:rPr>
+          <w:i w:val="0"/>
+        </w:rPr>
+        <w:t xml:space="preserve"> | </w:t>
+      </w:r>
+      <w:r>
+        <w:rPr>
+          <w:i/>
+        </w:rPr>
+        <w:t>W</w:t>
+      </w:r>
+      <w:r>
+        <w:rPr>
+          <w:i w:val="0"/>
+        </w:rPr>
+        <w:t xml:space="preserve">) = 0.304 deutlich kleiner als </w:t>
+      </w:r>
+      <w:r>
+        <w:rPr>
+          <w:i/>
+        </w:rPr>
+        <w:t>P</w:t>
+      </w:r>
+      <w:r>
+        <w:rPr>
+          <w:i w:val="0"/>
+        </w:rPr>
+        <w:t>(</w:t>
+      </w:r>
+      <w:r>
+        <w:rPr>
+          <w:i/>
+        </w:rPr>
+        <w:t>Z</w:t>
+      </w:r>
+      <w:r>
+        <w:rPr>
+          <w:i w:val="0"/>
+        </w:rPr>
+        <w:t>) = 0.388. Über alle Fachbereiche zusammen sind Zulassung und Geschlecht damit stochastisch abhängig.</w:t>
+      </w:r>
+    </w:p>
+    <w:p>
+      <w:pPr>
+        <w:keepNext w:val="0"/>
+      </w:pPr>
+      <w:r>
+        <w:rPr>
+          <w:i w:val="0"/>
+        </w:rPr>
+        <w:t>Tabelle 3 zeigt dieselbe Prüfung innerhalb jedes Fachbereichs, also die Unabhängigkeit gegeben den Fachbereich.</w:t>
+      </w:r>
+    </w:p>
+    <w:p>
+      <w:pPr>
+        <w:keepNext/>
+        <w:spacing w:after="0"/>
+      </w:pPr>
+      <w:r>
+        <w:rPr>
+          <w:b/>
+        </w:rPr>
+        <w:t>Tabelle 3</w:t>
       </w:r>
     </w:p>
     <w:p>
@@ -1842,32 +3531,32 @@
       </w:pPr>
       <w:r>
         <w:rPr>
-          <w:i w:val="0"/>
-        </w:rPr>
-        <w:t>Dieselbe Prüfung für jeden Fachbereich (bedingte Unabhängigkeit gegeben Fachbereich) liefert:</w:t>
+          <w:i/>
+        </w:rPr>
+        <w:t>Stochastische Unabhängigkeit je Fachbereich</w:t>
       </w:r>
     </w:p>
     <w:tbl>
       <w:tblPr>
         <w:tblStyle w:val="LightGrid-Accent1"/>
         <w:tblW w:type="auto" w:w="0"/>
+        <w:tblLayout w:type="fixed"/>
         <w:tblLook w:firstColumn="1" w:firstRow="1" w:lastColumn="0" w:lastRow="0" w:noHBand="0" w:noVBand="1" w:val="04A0"/>
       </w:tblPr>
       <w:tblGrid>
-        <w:gridCol w:w="1045"/>
-        <w:gridCol w:w="1045"/>
-        <w:gridCol w:w="1045"/>
-        <w:gridCol w:w="1045"/>
-        <w:gridCol w:w="1045"/>
-        <w:gridCol w:w="1045"/>
-        <w:gridCol w:w="1045"/>
-        <w:gridCol w:w="1045"/>
-        <w:gridCol w:w="1045"/>
+        <w:gridCol w:w="794"/>
+        <w:gridCol w:w="737"/>
+        <w:gridCol w:w="1077"/>
+        <w:gridCol w:w="1020"/>
+        <w:gridCol w:w="1020"/>
+        <w:gridCol w:w="1587"/>
+        <w:gridCol w:w="1247"/>
+        <w:gridCol w:w="1587"/>
       </w:tblGrid>
       <w:tr>
         <w:tc>
           <w:tcPr>
-            <w:tcW w:type="dxa" w:w="1045"/>
+            <w:tcW w:type="dxa" w:w="794"/>
           </w:tcPr>
           <w:p>
             <w:pPr>
@@ -1883,7 +3572,7 @@
         </w:tc>
         <w:tc>
           <w:tcPr>
-            <w:tcW w:type="dxa" w:w="1045"/>
+            <w:tcW w:type="dxa" w:w="737"/>
           </w:tcPr>
           <w:p>
             <w:pPr>
@@ -1899,7 +3588,23 @@
         </w:tc>
         <w:tc>
           <w:tcPr>
-            <w:tcW w:type="dxa" w:w="1045"/>
+            <w:tcW w:type="dxa" w:w="1077"/>
+          </w:tcPr>
+          <w:p>
+            <w:pPr>
+              <w:keepNext/>
+            </w:pPr>
+            <w:r>
+              <w:rPr>
+                <w:sz w:val="19"/>
+              </w:rPr>
+              <w:t>davon Frauen</w:t>
+            </w:r>
+          </w:p>
+        </w:tc>
+        <w:tc>
+          <w:tcPr>
+            <w:tcW w:type="dxa" w:w="1020"/>
           </w:tcPr>
           <w:p>
             <w:pPr>
@@ -1915,7 +3620,7 @@
         </w:tc>
         <w:tc>
           <w:tcPr>
-            <w:tcW w:type="dxa" w:w="1045"/>
+            <w:tcW w:type="dxa" w:w="1020"/>
           </w:tcPr>
           <w:p>
             <w:pPr>
@@ -1931,7 +3636,23 @@
         </w:tc>
         <w:tc>
           <w:tcPr>
-            <w:tcW w:type="dxa" w:w="1045"/>
+            <w:tcW w:type="dxa" w:w="1587"/>
+          </w:tcPr>
+          <w:p>
+            <w:pPr>
+              <w:keepNext/>
+            </w:pPr>
+            <w:r>
+              <w:rPr>
+                <w:sz w:val="19"/>
+              </w:rPr>
+              <w:t>Differenz (PP)</w:t>
+            </w:r>
+          </w:p>
+        </w:tc>
+        <w:tc>
+          <w:tcPr>
+            <w:tcW w:type="dxa" w:w="1247"/>
           </w:tcPr>
           <w:p>
             <w:pPr>
@@ -1947,7 +3668,7 @@
         </w:tc>
         <w:tc>
           <w:tcPr>
-            <w:tcW w:type="dxa" w:w="1045"/>
+            <w:tcW w:type="dxa" w:w="1587"/>
           </w:tcPr>
           <w:p>
             <w:pPr>
@@ -1961,9 +3682,11 @@
             </w:r>
           </w:p>
         </w:tc>
+      </w:tr>
+      <w:tr>
         <w:tc>
           <w:tcPr>
-            <w:tcW w:type="dxa" w:w="1045"/>
+            <w:tcW w:type="dxa" w:w="794"/>
           </w:tcPr>
           <w:p>
             <w:pPr>
@@ -1973,63 +3696,13 @@
               <w:rPr>
                 <w:sz w:val="19"/>
               </w:rPr>
-              <w:t>χ²</w:t>
+              <w:t>FB A</w:t>
             </w:r>
           </w:p>
         </w:tc>
         <w:tc>
           <w:tcPr>
-            <w:tcW w:type="dxa" w:w="1045"/>
-          </w:tcPr>
-          <w:p>
-            <w:pPr>
-              <w:keepNext/>
-            </w:pPr>
-            <w:r>
-              <w:rPr>
-                <w:sz w:val="19"/>
-              </w:rPr>
-              <w:t>p-Wert</w:t>
-            </w:r>
-          </w:p>
-        </w:tc>
-        <w:tc>
-          <w:tcPr>
-            <w:tcW w:type="dxa" w:w="1045"/>
-          </w:tcPr>
-          <w:p>
-            <w:pPr>
-              <w:keepNext/>
-            </w:pPr>
-            <w:r>
-              <w:rPr>
-                <w:sz w:val="19"/>
-              </w:rPr>
-              <w:t>unabhängig (α=5 %)?</w:t>
-            </w:r>
-          </w:p>
-        </w:tc>
-      </w:tr>
-      <w:tr>
-        <w:tc>
-          <w:tcPr>
-            <w:tcW w:type="dxa" w:w="1045"/>
-          </w:tcPr>
-          <w:p>
-            <w:pPr>
-              <w:keepNext/>
-            </w:pPr>
-            <w:r>
-              <w:rPr>
-                <w:sz w:val="19"/>
-              </w:rPr>
-              <w:t>A</w:t>
-            </w:r>
-          </w:p>
-        </w:tc>
-        <w:tc>
-          <w:tcPr>
-            <w:tcW w:type="dxa" w:w="1045"/>
+            <w:tcW w:type="dxa" w:w="737"/>
           </w:tcPr>
           <w:p>
             <w:pPr>
@@ -2045,7 +3718,7 @@
         </w:tc>
         <w:tc>
           <w:tcPr>
-            <w:tcW w:type="dxa" w:w="1045"/>
+            <w:tcW w:type="dxa" w:w="1077"/>
           </w:tcPr>
           <w:p>
             <w:pPr>
@@ -2055,13 +3728,13 @@
               <w:rPr>
                 <w:sz w:val="19"/>
               </w:rPr>
-              <w:t>82.4%</w:t>
+              <w:t>108</w:t>
             </w:r>
           </w:p>
         </w:tc>
         <w:tc>
           <w:tcPr>
-            <w:tcW w:type="dxa" w:w="1045"/>
+            <w:tcW w:type="dxa" w:w="1020"/>
           </w:tcPr>
           <w:p>
             <w:pPr>
@@ -2071,13 +3744,45 @@
               <w:rPr>
                 <w:sz w:val="19"/>
               </w:rPr>
-              <w:t>62.1%</w:t>
+              <w:t>82.4 %</w:t>
             </w:r>
           </w:p>
         </w:tc>
         <w:tc>
           <w:tcPr>
-            <w:tcW w:type="dxa" w:w="1045"/>
+            <w:tcW w:type="dxa" w:w="1020"/>
+          </w:tcPr>
+          <w:p>
+            <w:pPr>
+              <w:keepNext/>
+            </w:pPr>
+            <w:r>
+              <w:rPr>
+                <w:sz w:val="19"/>
+              </w:rPr>
+              <w:t>62.1 %</w:t>
+            </w:r>
+          </w:p>
+        </w:tc>
+        <w:tc>
+          <w:tcPr>
+            <w:tcW w:type="dxa" w:w="1587"/>
+          </w:tcPr>
+          <w:p>
+            <w:pPr>
+              <w:keepNext/>
+            </w:pPr>
+            <w:r>
+              <w:rPr>
+                <w:sz w:val="19"/>
+              </w:rPr>
+              <w:t>+20.3</w:t>
+            </w:r>
+          </w:p>
+        </w:tc>
+        <w:tc>
+          <w:tcPr>
+            <w:tcW w:type="dxa" w:w="1247"/>
           </w:tcPr>
           <w:p>
             <w:pPr>
@@ -2093,7 +3798,7 @@
         </w:tc>
         <w:tc>
           <w:tcPr>
-            <w:tcW w:type="dxa" w:w="1045"/>
+            <w:tcW w:type="dxa" w:w="1587"/>
           </w:tcPr>
           <w:p>
             <w:pPr>
@@ -2107,9 +3812,11 @@
             </w:r>
           </w:p>
         </w:tc>
+      </w:tr>
+      <w:tr>
         <w:tc>
           <w:tcPr>
-            <w:tcW w:type="dxa" w:w="1045"/>
+            <w:tcW w:type="dxa" w:w="794"/>
           </w:tcPr>
           <w:p>
             <w:pPr>
@@ -2119,63 +3826,13 @@
               <w:rPr>
                 <w:sz w:val="19"/>
               </w:rPr>
-              <w:t>17.25</w:t>
+              <w:t>FB B</w:t>
             </w:r>
           </w:p>
         </w:tc>
         <w:tc>
           <w:tcPr>
-            <w:tcW w:type="dxa" w:w="1045"/>
-          </w:tcPr>
-          <w:p>
-            <w:pPr>
-              <w:keepNext/>
-            </w:pPr>
-            <w:r>
-              <w:rPr>
-                <w:sz w:val="19"/>
-              </w:rPr>
-              <w:t>&lt; 0.001</w:t>
-            </w:r>
-          </w:p>
-        </w:tc>
-        <w:tc>
-          <w:tcPr>
-            <w:tcW w:type="dxa" w:w="1045"/>
-          </w:tcPr>
-          <w:p>
-            <w:pPr>
-              <w:keepNext/>
-            </w:pPr>
-            <w:r>
-              <w:rPr>
-                <w:sz w:val="19"/>
-              </w:rPr>
-              <w:t>nein</w:t>
-            </w:r>
-          </w:p>
-        </w:tc>
-      </w:tr>
-      <w:tr>
-        <w:tc>
-          <w:tcPr>
-            <w:tcW w:type="dxa" w:w="1045"/>
-          </w:tcPr>
-          <w:p>
-            <w:pPr>
-              <w:keepNext/>
-            </w:pPr>
-            <w:r>
-              <w:rPr>
-                <w:sz w:val="19"/>
-              </w:rPr>
-              <w:t>B</w:t>
-            </w:r>
-          </w:p>
-        </w:tc>
-        <w:tc>
-          <w:tcPr>
-            <w:tcW w:type="dxa" w:w="1045"/>
+            <w:tcW w:type="dxa" w:w="737"/>
           </w:tcPr>
           <w:p>
             <w:pPr>
@@ -2191,7 +3848,7 @@
         </w:tc>
         <w:tc>
           <w:tcPr>
-            <w:tcW w:type="dxa" w:w="1045"/>
+            <w:tcW w:type="dxa" w:w="1077"/>
           </w:tcPr>
           <w:p>
             <w:pPr>
@@ -2201,13 +3858,13 @@
               <w:rPr>
                 <w:sz w:val="19"/>
               </w:rPr>
-              <w:t>68.0%</w:t>
+              <w:t>25</w:t>
             </w:r>
           </w:p>
         </w:tc>
         <w:tc>
           <w:tcPr>
-            <w:tcW w:type="dxa" w:w="1045"/>
+            <w:tcW w:type="dxa" w:w="1020"/>
           </w:tcPr>
           <w:p>
             <w:pPr>
@@ -2217,13 +3874,45 @@
               <w:rPr>
                 <w:sz w:val="19"/>
               </w:rPr>
-              <w:t>63.0%</w:t>
+              <w:t>68.0 %</w:t>
             </w:r>
           </w:p>
         </w:tc>
         <w:tc>
           <w:tcPr>
-            <w:tcW w:type="dxa" w:w="1045"/>
+            <w:tcW w:type="dxa" w:w="1020"/>
+          </w:tcPr>
+          <w:p>
+            <w:pPr>
+              <w:keepNext/>
+            </w:pPr>
+            <w:r>
+              <w:rPr>
+                <w:sz w:val="19"/>
+              </w:rPr>
+              <w:t>63.0 %</w:t>
+            </w:r>
+          </w:p>
+        </w:tc>
+        <w:tc>
+          <w:tcPr>
+            <w:tcW w:type="dxa" w:w="1587"/>
+          </w:tcPr>
+          <w:p>
+            <w:pPr>
+              <w:keepNext/>
+            </w:pPr>
+            <w:r>
+              <w:rPr>
+                <w:sz w:val="19"/>
+              </w:rPr>
+              <w:t>+5.0</w:t>
+            </w:r>
+          </w:p>
+        </w:tc>
+        <w:tc>
+          <w:tcPr>
+            <w:tcW w:type="dxa" w:w="1247"/>
           </w:tcPr>
           <w:p>
             <w:pPr>
@@ -2239,7 +3928,7 @@
         </w:tc>
         <w:tc>
           <w:tcPr>
-            <w:tcW w:type="dxa" w:w="1045"/>
+            <w:tcW w:type="dxa" w:w="1587"/>
           </w:tcPr>
           <w:p>
             <w:pPr>
@@ -2253,9 +3942,11 @@
             </w:r>
           </w:p>
         </w:tc>
+      </w:tr>
+      <w:tr>
         <w:tc>
           <w:tcPr>
-            <w:tcW w:type="dxa" w:w="1045"/>
+            <w:tcW w:type="dxa" w:w="794"/>
           </w:tcPr>
           <w:p>
             <w:pPr>
@@ -2265,63 +3956,13 @@
               <w:rPr>
                 <w:sz w:val="19"/>
               </w:rPr>
-              <w:t>0.25</w:t>
+              <w:t>FB C</w:t>
             </w:r>
           </w:p>
         </w:tc>
         <w:tc>
           <w:tcPr>
-            <w:tcW w:type="dxa" w:w="1045"/>
-          </w:tcPr>
-          <w:p>
-            <w:pPr>
-              <w:keepNext/>
-            </w:pPr>
-            <w:r>
-              <w:rPr>
-                <w:sz w:val="19"/>
-              </w:rPr>
-              <w:t>0.614</w:t>
-            </w:r>
-          </w:p>
-        </w:tc>
-        <w:tc>
-          <w:tcPr>
-            <w:tcW w:type="dxa" w:w="1045"/>
-          </w:tcPr>
-          <w:p>
-            <w:pPr>
-              <w:keepNext/>
-            </w:pPr>
-            <w:r>
-              <w:rPr>
-                <w:sz w:val="19"/>
-              </w:rPr>
-              <w:t>ja</w:t>
-            </w:r>
-          </w:p>
-        </w:tc>
-      </w:tr>
-      <w:tr>
-        <w:tc>
-          <w:tcPr>
-            <w:tcW w:type="dxa" w:w="1045"/>
-          </w:tcPr>
-          <w:p>
-            <w:pPr>
-              <w:keepNext/>
-            </w:pPr>
-            <w:r>
-              <w:rPr>
-                <w:sz w:val="19"/>
-              </w:rPr>
-              <w:t>C</w:t>
-            </w:r>
-          </w:p>
-        </w:tc>
-        <w:tc>
-          <w:tcPr>
-            <w:tcW w:type="dxa" w:w="1045"/>
+            <w:tcW w:type="dxa" w:w="737"/>
           </w:tcPr>
           <w:p>
             <w:pPr>
@@ -2337,7 +3978,7 @@
         </w:tc>
         <w:tc>
           <w:tcPr>
-            <w:tcW w:type="dxa" w:w="1045"/>
+            <w:tcW w:type="dxa" w:w="1077"/>
           </w:tcPr>
           <w:p>
             <w:pPr>
@@ -2347,13 +3988,13 @@
               <w:rPr>
                 <w:sz w:val="19"/>
               </w:rPr>
-              <w:t>34.1%</w:t>
+              <w:t>593</w:t>
             </w:r>
           </w:p>
         </w:tc>
         <w:tc>
           <w:tcPr>
-            <w:tcW w:type="dxa" w:w="1045"/>
+            <w:tcW w:type="dxa" w:w="1020"/>
           </w:tcPr>
           <w:p>
             <w:pPr>
@@ -2363,13 +4004,45 @@
               <w:rPr>
                 <w:sz w:val="19"/>
               </w:rPr>
-              <w:t>36.9%</w:t>
+              <w:t>34.1 %</w:t>
             </w:r>
           </w:p>
         </w:tc>
         <w:tc>
           <w:tcPr>
-            <w:tcW w:type="dxa" w:w="1045"/>
+            <w:tcW w:type="dxa" w:w="1020"/>
+          </w:tcPr>
+          <w:p>
+            <w:pPr>
+              <w:keepNext/>
+            </w:pPr>
+            <w:r>
+              <w:rPr>
+                <w:sz w:val="19"/>
+              </w:rPr>
+              <w:t>36.9 %</w:t>
+            </w:r>
+          </w:p>
+        </w:tc>
+        <w:tc>
+          <w:tcPr>
+            <w:tcW w:type="dxa" w:w="1587"/>
+          </w:tcPr>
+          <w:p>
+            <w:pPr>
+              <w:keepNext/>
+            </w:pPr>
+            <w:r>
+              <w:rPr>
+                <w:sz w:val="19"/>
+              </w:rPr>
+              <w:t>−2.9</w:t>
+            </w:r>
+          </w:p>
+        </w:tc>
+        <w:tc>
+          <w:tcPr>
+            <w:tcW w:type="dxa" w:w="1247"/>
           </w:tcPr>
           <w:p>
             <w:pPr>
@@ -2385,7 +4058,7 @@
         </w:tc>
         <w:tc>
           <w:tcPr>
-            <w:tcW w:type="dxa" w:w="1045"/>
+            <w:tcW w:type="dxa" w:w="1587"/>
           </w:tcPr>
           <w:p>
             <w:pPr>
@@ -2399,9 +4072,11 @@
             </w:r>
           </w:p>
         </w:tc>
+      </w:tr>
+      <w:tr>
         <w:tc>
           <w:tcPr>
-            <w:tcW w:type="dxa" w:w="1045"/>
+            <w:tcW w:type="dxa" w:w="794"/>
           </w:tcPr>
           <w:p>
             <w:pPr>
@@ -2411,63 +4086,13 @@
               <w:rPr>
                 <w:sz w:val="19"/>
               </w:rPr>
-              <w:t>0.75</w:t>
+              <w:t>FB D</w:t>
             </w:r>
           </w:p>
         </w:tc>
         <w:tc>
           <w:tcPr>
-            <w:tcW w:type="dxa" w:w="1045"/>
-          </w:tcPr>
-          <w:p>
-            <w:pPr>
-              <w:keepNext/>
-            </w:pPr>
-            <w:r>
-              <w:rPr>
-                <w:sz w:val="19"/>
-              </w:rPr>
-              <w:t>0.385</w:t>
-            </w:r>
-          </w:p>
-        </w:tc>
-        <w:tc>
-          <w:tcPr>
-            <w:tcW w:type="dxa" w:w="1045"/>
-          </w:tcPr>
-          <w:p>
-            <w:pPr>
-              <w:keepNext/>
-            </w:pPr>
-            <w:r>
-              <w:rPr>
-                <w:sz w:val="19"/>
-              </w:rPr>
-              <w:t>ja</w:t>
-            </w:r>
-          </w:p>
-        </w:tc>
-      </w:tr>
-      <w:tr>
-        <w:tc>
-          <w:tcPr>
-            <w:tcW w:type="dxa" w:w="1045"/>
-          </w:tcPr>
-          <w:p>
-            <w:pPr>
-              <w:keepNext/>
-            </w:pPr>
-            <w:r>
-              <w:rPr>
-                <w:sz w:val="19"/>
-              </w:rPr>
-              <w:t>D</w:t>
-            </w:r>
-          </w:p>
-        </w:tc>
-        <w:tc>
-          <w:tcPr>
-            <w:tcW w:type="dxa" w:w="1045"/>
+            <w:tcW w:type="dxa" w:w="737"/>
           </w:tcPr>
           <w:p>
             <w:pPr>
@@ -2483,7 +4108,7 @@
         </w:tc>
         <w:tc>
           <w:tcPr>
-            <w:tcW w:type="dxa" w:w="1045"/>
+            <w:tcW w:type="dxa" w:w="1077"/>
           </w:tcPr>
           <w:p>
             <w:pPr>
@@ -2493,13 +4118,13 @@
               <w:rPr>
                 <w:sz w:val="19"/>
               </w:rPr>
-              <w:t>34.9%</w:t>
+              <w:t>375</w:t>
             </w:r>
           </w:p>
         </w:tc>
         <w:tc>
           <w:tcPr>
-            <w:tcW w:type="dxa" w:w="1045"/>
+            <w:tcW w:type="dxa" w:w="1020"/>
           </w:tcPr>
           <w:p>
             <w:pPr>
@@ -2509,13 +4134,45 @@
               <w:rPr>
                 <w:sz w:val="19"/>
               </w:rPr>
-              <w:t>33.1%</w:t>
+              <w:t>34.9 %</w:t>
             </w:r>
           </w:p>
         </w:tc>
         <w:tc>
           <w:tcPr>
-            <w:tcW w:type="dxa" w:w="1045"/>
+            <w:tcW w:type="dxa" w:w="1020"/>
+          </w:tcPr>
+          <w:p>
+            <w:pPr>
+              <w:keepNext/>
+            </w:pPr>
+            <w:r>
+              <w:rPr>
+                <w:sz w:val="19"/>
+              </w:rPr>
+              <w:t>33.1 %</w:t>
+            </w:r>
+          </w:p>
+        </w:tc>
+        <w:tc>
+          <w:tcPr>
+            <w:tcW w:type="dxa" w:w="1587"/>
+          </w:tcPr>
+          <w:p>
+            <w:pPr>
+              <w:keepNext/>
+            </w:pPr>
+            <w:r>
+              <w:rPr>
+                <w:sz w:val="19"/>
+              </w:rPr>
+              <w:t>+1.8</w:t>
+            </w:r>
+          </w:p>
+        </w:tc>
+        <w:tc>
+          <w:tcPr>
+            <w:tcW w:type="dxa" w:w="1247"/>
           </w:tcPr>
           <w:p>
             <w:pPr>
@@ -2531,7 +4188,7 @@
         </w:tc>
         <w:tc>
           <w:tcPr>
-            <w:tcW w:type="dxa" w:w="1045"/>
+            <w:tcW w:type="dxa" w:w="1587"/>
           </w:tcPr>
           <w:p>
             <w:pPr>
@@ -2545,9 +4202,11 @@
             </w:r>
           </w:p>
         </w:tc>
+      </w:tr>
+      <w:tr>
         <w:tc>
           <w:tcPr>
-            <w:tcW w:type="dxa" w:w="1045"/>
+            <w:tcW w:type="dxa" w:w="794"/>
           </w:tcPr>
           <w:p>
             <w:pPr>
@@ -2557,63 +4216,13 @@
               <w:rPr>
                 <w:sz w:val="19"/>
               </w:rPr>
-              <w:t>0.30</w:t>
+              <w:t>FB E</w:t>
             </w:r>
           </w:p>
         </w:tc>
         <w:tc>
           <w:tcPr>
-            <w:tcW w:type="dxa" w:w="1045"/>
-          </w:tcPr>
-          <w:p>
-            <w:pPr>
-              <w:keepNext/>
-            </w:pPr>
-            <w:r>
-              <w:rPr>
-                <w:sz w:val="19"/>
-              </w:rPr>
-              <w:t>0.585</w:t>
-            </w:r>
-          </w:p>
-        </w:tc>
-        <w:tc>
-          <w:tcPr>
-            <w:tcW w:type="dxa" w:w="1045"/>
-          </w:tcPr>
-          <w:p>
-            <w:pPr>
-              <w:keepNext/>
-            </w:pPr>
-            <w:r>
-              <w:rPr>
-                <w:sz w:val="19"/>
-              </w:rPr>
-              <w:t>ja</w:t>
-            </w:r>
-          </w:p>
-        </w:tc>
-      </w:tr>
-      <w:tr>
-        <w:tc>
-          <w:tcPr>
-            <w:tcW w:type="dxa" w:w="1045"/>
-          </w:tcPr>
-          <w:p>
-            <w:pPr>
-              <w:keepNext/>
-            </w:pPr>
-            <w:r>
-              <w:rPr>
-                <w:sz w:val="19"/>
-              </w:rPr>
-              <w:t>E</w:t>
-            </w:r>
-          </w:p>
-        </w:tc>
-        <w:tc>
-          <w:tcPr>
-            <w:tcW w:type="dxa" w:w="1045"/>
+            <w:tcW w:type="dxa" w:w="737"/>
           </w:tcPr>
           <w:p>
             <w:pPr>
@@ -2629,7 +4238,7 @@
         </w:tc>
         <w:tc>
           <w:tcPr>
-            <w:tcW w:type="dxa" w:w="1045"/>
+            <w:tcW w:type="dxa" w:w="1077"/>
           </w:tcPr>
           <w:p>
             <w:pPr>
@@ -2639,13 +4248,13 @@
               <w:rPr>
                 <w:sz w:val="19"/>
               </w:rPr>
-              <w:t>23.9%</w:t>
+              <w:t>393</w:t>
             </w:r>
           </w:p>
         </w:tc>
         <w:tc>
           <w:tcPr>
-            <w:tcW w:type="dxa" w:w="1045"/>
+            <w:tcW w:type="dxa" w:w="1020"/>
           </w:tcPr>
           <w:p>
             <w:pPr>
@@ -2655,13 +4264,45 @@
               <w:rPr>
                 <w:sz w:val="19"/>
               </w:rPr>
-              <w:t>27.7%</w:t>
+              <w:t>23.9 %</w:t>
             </w:r>
           </w:p>
         </w:tc>
         <w:tc>
           <w:tcPr>
-            <w:tcW w:type="dxa" w:w="1045"/>
+            <w:tcW w:type="dxa" w:w="1020"/>
+          </w:tcPr>
+          <w:p>
+            <w:pPr>
+              <w:keepNext/>
+            </w:pPr>
+            <w:r>
+              <w:rPr>
+                <w:sz w:val="19"/>
+              </w:rPr>
+              <w:t>27.7 %</w:t>
+            </w:r>
+          </w:p>
+        </w:tc>
+        <w:tc>
+          <w:tcPr>
+            <w:tcW w:type="dxa" w:w="1587"/>
+          </w:tcPr>
+          <w:p>
+            <w:pPr>
+              <w:keepNext/>
+            </w:pPr>
+            <w:r>
+              <w:rPr>
+                <w:sz w:val="19"/>
+              </w:rPr>
+              <w:t>−3.8</w:t>
+            </w:r>
+          </w:p>
+        </w:tc>
+        <w:tc>
+          <w:tcPr>
+            <w:tcW w:type="dxa" w:w="1247"/>
           </w:tcPr>
           <w:p>
             <w:pPr>
@@ -2677,7 +4318,7 @@
         </w:tc>
         <w:tc>
           <w:tcPr>
-            <w:tcW w:type="dxa" w:w="1045"/>
+            <w:tcW w:type="dxa" w:w="1587"/>
           </w:tcPr>
           <w:p>
             <w:pPr>
@@ -2691,9 +4332,11 @@
             </w:r>
           </w:p>
         </w:tc>
+      </w:tr>
+      <w:tr>
         <w:tc>
           <w:tcPr>
-            <w:tcW w:type="dxa" w:w="1045"/>
+            <w:tcW w:type="dxa" w:w="794"/>
           </w:tcPr>
           <w:p>
             <w:pPr>
@@ -2703,67 +4346,17 @@
               <w:rPr>
                 <w:sz w:val="19"/>
               </w:rPr>
-              <w:t>1.00</w:t>
+              <w:t>FB F</w:t>
             </w:r>
           </w:p>
         </w:tc>
         <w:tc>
           <w:tcPr>
-            <w:tcW w:type="dxa" w:w="1045"/>
+            <w:tcW w:type="dxa" w:w="737"/>
           </w:tcPr>
           <w:p>
             <w:pPr>
               <w:keepNext/>
-            </w:pPr>
-            <w:r>
-              <w:rPr>
-                <w:sz w:val="19"/>
-              </w:rPr>
-              <w:t>0.317</w:t>
-            </w:r>
-          </w:p>
-        </w:tc>
-        <w:tc>
-          <w:tcPr>
-            <w:tcW w:type="dxa" w:w="1045"/>
-          </w:tcPr>
-          <w:p>
-            <w:pPr>
-              <w:keepNext/>
-            </w:pPr>
-            <w:r>
-              <w:rPr>
-                <w:sz w:val="19"/>
-              </w:rPr>
-              <w:t>ja</w:t>
-            </w:r>
-          </w:p>
-        </w:tc>
-      </w:tr>
-      <w:tr>
-        <w:tc>
-          <w:tcPr>
-            <w:tcW w:type="dxa" w:w="1045"/>
-          </w:tcPr>
-          <w:p>
-            <w:pPr>
-              <w:keepNext w:val="0"/>
-            </w:pPr>
-            <w:r>
-              <w:rPr>
-                <w:sz w:val="19"/>
-              </w:rPr>
-              <w:t>F</w:t>
-            </w:r>
-          </w:p>
-        </w:tc>
-        <w:tc>
-          <w:tcPr>
-            <w:tcW w:type="dxa" w:w="1045"/>
-          </w:tcPr>
-          <w:p>
-            <w:pPr>
-              <w:keepNext w:val="0"/>
             </w:pPr>
             <w:r>
               <w:rPr>
@@ -2775,43 +4368,75 @@
         </w:tc>
         <w:tc>
           <w:tcPr>
-            <w:tcW w:type="dxa" w:w="1045"/>
+            <w:tcW w:type="dxa" w:w="1077"/>
           </w:tcPr>
           <w:p>
             <w:pPr>
-              <w:keepNext w:val="0"/>
+              <w:keepNext/>
             </w:pPr>
             <w:r>
               <w:rPr>
                 <w:sz w:val="19"/>
               </w:rPr>
-              <w:t>7.0%</w:t>
+              <w:t>341</w:t>
             </w:r>
           </w:p>
         </w:tc>
         <w:tc>
           <w:tcPr>
-            <w:tcW w:type="dxa" w:w="1045"/>
+            <w:tcW w:type="dxa" w:w="1020"/>
           </w:tcPr>
           <w:p>
             <w:pPr>
-              <w:keepNext w:val="0"/>
+              <w:keepNext/>
             </w:pPr>
             <w:r>
               <w:rPr>
                 <w:sz w:val="19"/>
               </w:rPr>
-              <w:t>5.9%</w:t>
+              <w:t>7.0 %</w:t>
             </w:r>
           </w:p>
         </w:tc>
         <w:tc>
           <w:tcPr>
-            <w:tcW w:type="dxa" w:w="1045"/>
+            <w:tcW w:type="dxa" w:w="1020"/>
           </w:tcPr>
           <w:p>
             <w:pPr>
-              <w:keepNext w:val="0"/>
+              <w:keepNext/>
+            </w:pPr>
+            <w:r>
+              <w:rPr>
+                <w:sz w:val="19"/>
+              </w:rPr>
+              <w:t>5.9 %</w:t>
+            </w:r>
+          </w:p>
+        </w:tc>
+        <w:tc>
+          <w:tcPr>
+            <w:tcW w:type="dxa" w:w="1587"/>
+          </w:tcPr>
+          <w:p>
+            <w:pPr>
+              <w:keepNext/>
+            </w:pPr>
+            <w:r>
+              <w:rPr>
+                <w:sz w:val="19"/>
+              </w:rPr>
+              <w:t>+1.1</w:t>
+            </w:r>
+          </w:p>
+        </w:tc>
+        <w:tc>
+          <w:tcPr>
+            <w:tcW w:type="dxa" w:w="1247"/>
+          </w:tcPr>
+          <w:p>
+            <w:pPr>
+              <w:keepNext/>
             </w:pPr>
             <w:r>
               <w:rPr>
@@ -2823,11 +4448,11 @@
         </w:tc>
         <w:tc>
           <w:tcPr>
-            <w:tcW w:type="dxa" w:w="1045"/>
+            <w:tcW w:type="dxa" w:w="1587"/>
           </w:tcPr>
           <w:p>
             <w:pPr>
-              <w:keepNext w:val="0"/>
+              <w:keepNext/>
             </w:pPr>
             <w:r>
               <w:rPr>
@@ -2837,63 +4462,130 @@
             </w:r>
           </w:p>
         </w:tc>
-        <w:tc>
-          <w:tcPr>
-            <w:tcW w:type="dxa" w:w="1045"/>
-          </w:tcPr>
-          <w:p>
-            <w:pPr>
-              <w:keepNext w:val="0"/>
-            </w:pPr>
-            <w:r>
-              <w:rPr>
-                <w:sz w:val="19"/>
-              </w:rPr>
-              <w:t>0.38</w:t>
-            </w:r>
-          </w:p>
-        </w:tc>
-        <w:tc>
-          <w:tcPr>
-            <w:tcW w:type="dxa" w:w="1045"/>
-          </w:tcPr>
-          <w:p>
-            <w:pPr>
-              <w:keepNext w:val="0"/>
-            </w:pPr>
-            <w:r>
-              <w:rPr>
-                <w:sz w:val="19"/>
-              </w:rPr>
-              <w:t>0.535</w:t>
-            </w:r>
-          </w:p>
-        </w:tc>
-        <w:tc>
-          <w:tcPr>
-            <w:tcW w:type="dxa" w:w="1045"/>
-          </w:tcPr>
-          <w:p>
-            <w:pPr>
-              <w:keepNext w:val="0"/>
-            </w:pPr>
-            <w:r>
-              <w:rPr>
-                <w:sz w:val="19"/>
-              </w:rPr>
-              <w:t>ja</w:t>
-            </w:r>
-          </w:p>
-        </w:tc>
       </w:tr>
     </w:tbl>
-    <w:p/>
     <w:p>
+      <w:pPr>
+        <w:spacing w:after="240"/>
+      </w:pPr>
+      <w:r>
+        <w:rPr>
+          <w:i/>
+          <w:sz w:val="19"/>
+        </w:rPr>
+        <w:t xml:space="preserve">Anmerkung. </w:t>
+      </w:r>
+      <w:r>
+        <w:rPr>
+          <w:sz w:val="19"/>
+        </w:rPr>
+        <w:t>Eigene Berechnung. PP = Prozentpunkte (Frauen minus Männer). Daten aus Bickel et al. (1975) bzw. R Core Team (o. J.).</w:t>
+      </w:r>
+    </w:p>
+    <w:p>
+      <w:pPr>
+        <w:keepNext w:val="0"/>
+      </w:pPr>
       <w:r>
         <w:rPr>
           <w:i w:val="0"/>
         </w:rPr>
-        <w:t>In den Fachbereichen B bis F liegen P(Z ∩ W) und P(Z) · P(W) sehr nahe beieinander, und die Unabhängigkeit kann nicht verworfen werden (alle p &gt; 0.3, auch bei α = 1 %). Nur in Fachbereich A besteht eine signifikante Abhängigkeit, allerdings zugunsten der Frauen (82.4 % gegenüber 62.1 %). Ergänzend zeigen zwei weitere Chi-Quadrat-Tests, woher die aggregierte Abhängigkeit stammt: Geschlecht und Fachbereichswahl sind stark abhängig (χ² = 1 068.4; df = 5; p &lt; 0.001), und Zulassung und Fachbereich ebenso (χ² = 778.9; df = 5; p &lt; 0.001). Der Fachbereich ist damit die Drittvariable, die den scheinbaren Zusammenhang zwischen Geschlecht und Zulassung erzeugt.</w:t>
+        <w:t xml:space="preserve">In den Fachbereichen B bis F liegen </w:t>
+      </w:r>
+      <w:r>
+        <w:rPr>
+          <w:i/>
+        </w:rPr>
+        <w:t>P</w:t>
+      </w:r>
+      <w:r>
+        <w:rPr>
+          <w:i w:val="0"/>
+        </w:rPr>
+        <w:t>(</w:t>
+      </w:r>
+      <w:r>
+        <w:rPr>
+          <w:i/>
+        </w:rPr>
+        <w:t>Z</w:t>
+      </w:r>
+      <w:r>
+        <w:rPr>
+          <w:i w:val="0"/>
+        </w:rPr>
+        <w:t xml:space="preserve"> ∩ </w:t>
+      </w:r>
+      <w:r>
+        <w:rPr>
+          <w:i/>
+        </w:rPr>
+        <w:t>W</w:t>
+      </w:r>
+      <w:r>
+        <w:rPr>
+          <w:i w:val="0"/>
+        </w:rPr>
+        <w:t xml:space="preserve">) und </w:t>
+      </w:r>
+      <w:r>
+        <w:rPr>
+          <w:i/>
+        </w:rPr>
+        <w:t>P</w:t>
+      </w:r>
+      <w:r>
+        <w:rPr>
+          <w:i w:val="0"/>
+        </w:rPr>
+        <w:t>(</w:t>
+      </w:r>
+      <w:r>
+        <w:rPr>
+          <w:i/>
+        </w:rPr>
+        <w:t>Z</w:t>
+      </w:r>
+      <w:r>
+        <w:rPr>
+          <w:i w:val="0"/>
+        </w:rPr>
+        <w:t xml:space="preserve">) · </w:t>
+      </w:r>
+      <w:r>
+        <w:rPr>
+          <w:i/>
+        </w:rPr>
+        <w:t>P</w:t>
+      </w:r>
+      <w:r>
+        <w:rPr>
+          <w:i w:val="0"/>
+        </w:rPr>
+        <w:t>(</w:t>
+      </w:r>
+      <w:r>
+        <w:rPr>
+          <w:i/>
+        </w:rPr>
+        <w:t>W</w:t>
+      </w:r>
+      <w:r>
+        <w:rPr>
+          <w:i w:val="0"/>
+        </w:rPr>
+        <w:t>) nahe beieinander. Die Differenzen der Quoten betragen höchstens 5 Prozentpunkte und wechseln die Richtung: In B, D und F liegen die Frauen vorne, in C und E die Männer. Ein systematisches Muster ist nicht erkennbar; Zulassung und Geschlecht sind hier annähernd unabhängig. Die +5.0 Prozentpunkte in B beruhen zudem auf nur 25 Bewerbungen von Frauen. Einzig in Fachbereich A besteht ein deutlicher Unterschied, und zwar zugunsten der Frauen (82.4 % gegenüber 62.1 %).</w:t>
+      </w:r>
+    </w:p>
+    <w:p>
+      <w:pPr>
+        <w:keepNext w:val="0"/>
+      </w:pPr>
+      <w:r>
+        <w:rPr>
+          <w:i w:val="0"/>
+        </w:rPr>
+        <w:t>Die Abhängigkeit über alle Fachbereiche entsteht also nicht innerhalb der Fachbereiche, sondern durch die Drittvariable Fachbereich: Das Geschlecht hängt mit der Wahl des Fachbereichs zusammen (Abbildung 3), und der Fachbereich hängt mit der Zulassungsquote zusammen (Abbildung 4). Genau diese Konstellation beschreibt das Simpson-Paradoxon (Simpson, 1951).</w:t>
       </w:r>
     </w:p>
     <w:p>
@@ -2901,31 +4593,40 @@
         <w:pStyle w:val="Heading1"/>
       </w:pPr>
       <w:r>
-        <w:t>7  Fazit und kritische Würdigung</w:t>
+        <w:t>7  Fazit, Grenzen und Ausblick</w:t>
       </w:r>
     </w:p>
     <w:p>
+      <w:pPr>
+        <w:keepNext w:val="0"/>
+      </w:pPr>
       <w:r>
         <w:rPr>
           <w:i w:val="0"/>
         </w:rPr>
-        <w:t>Die aggregierte Darstellung aus Aufgabe (b) legt eine klare Benachteiligung von Frauen nahe. Der Vergleich der Verteilungen in Aufgabe (c) zeigt jedoch, dass die Fachbereiche, die über die Zulassung entscheiden, Frauen nicht benachteiligten. Zulassung und Geschlecht sind insgesamt stochastisch abhängig, innerhalb der Fachbereiche aber (mit Ausnahme von A) unabhängig. Der Unterschied entsteht allein dadurch, dass sich Frauen häufiger in stark nachgefragten Fachbereichen mit tiefen Zulassungsquoten bewarben. Das ist ein Lehrbuchbeispiel für das Simpson-Paradoxon.</w:t>
+        <w:t>Die aggregierte Darstellung aus Aufgabe (b) legt eine klare Benachteiligung von Frauen nahe. Der Vergleich der Verteilungen in Aufgabe (c) zeigt jedoch, dass die Fachbereiche, die über die Zulassung entscheiden, Frauen nicht benachteiligten. Zulassung und Geschlecht sind insgesamt stochastisch abhängig, innerhalb der Fachbereiche aber annähernd unabhängig, mit Fachbereich A als Ausnahme zugunsten der Frauen. Der Unterschied entsteht dadurch, dass sich Frauen häufiger in stark umkämpften Fachbereichen mit tiefen Zulassungsquoten bewarben. Das bestätigt den Befund von Bickel et al. (1975).</w:t>
       </w:r>
     </w:p>
     <w:p>
+      <w:pPr>
+        <w:keepNext w:val="0"/>
+      </w:pPr>
       <w:r>
         <w:rPr>
           <w:i w:val="0"/>
         </w:rPr>
-        <w:t>Daraus folgt für die Praxis: Aggregierte Quoten dürfen erst dann kausal interpretiert werden, wenn relevante Drittvariablen berücksichtigt sind. Umgekehrt beweisen die Daten nicht, dass keinerlei Ungleichbehandlung bestand. Offen bleibt, warum Frauen sich vor allem in Fachbereichen mit weniger Studienplätzen pro Bewerbung bewarben, etwa wegen unterschiedlicher Finanzierung der Fachbereiche oder gesellschaftlicher Prägungen bei der Studienwahl. Zudem handelt es sich um Beobachtungsdaten eines einzigen Jahres, und weitere Einflussgrössen wie die Qualifikation der Bewerbenden sind nicht erfasst.</w:t>
+        <w:t>Grenzen: Die Daten zeigen nicht, dass es keinerlei Ungleichbehandlung gab. Offen bleibt, warum sich Frauen vor allem in Fachbereichen mit wenigen Studienplätzen pro Bewerbung bewarben; dafür fehlen Informationen zu den Fachbereichen und zu den Bewerbenden, etwa zu ihrer Qualifikation. Zudem handelt es sich um Beobachtungsdaten eines einzigen Jahres. Unsere Beurteilung der Unabhängigkeit innerhalb der Fachbereiche ist beschreibend. Ob kleine Abweichungen wie in B bis F zufällig sind, liesse sich mit einem Hypothesentest prüfen; Hypothesentests werden im Kurs erst später behandelt (ZHAW SML, 2023).</w:t>
       </w:r>
     </w:p>
     <w:p>
+      <w:pPr>
+        <w:keepNext w:val="0"/>
+      </w:pPr>
       <w:r>
         <w:rPr>
           <w:i w:val="0"/>
         </w:rPr>
-        <w:t>Programmtechnisch hat sich die Kapselung in Funktionen bewährt: Dieselben Funktionen (vierfeldertafel, pruefe_unabhaengigkeit, gesamtquote, gruppiertes_balkendiagramm) werden für die Gesamtbetrachtung, für jeden Fachbereich und für die Standardisierung verwendet. Der Code bleibt dadurch kurz, lesbar und für andere Datensätze wiederverwendbar.</w:t>
+        <w:t>Programmtechnisch hat sich die Kapselung in Funktionen bewährt: Dieselben Funktionen (kreuztabelle, pruefe_unabhaengigkeit, gesamtquote, gruppiertes_saeulendiagramm) dienen der Gesamtbetrachtung, der Analyse je Fachbereich und der Standardisierung. Der Code bleibt dadurch kurz, lesbar und für andere Datensätze wiederverwendbar.</w:t>
       </w:r>
     </w:p>
     <w:p>
@@ -2938,63 +4639,266 @@
         <w:pStyle w:val="Heading1"/>
       </w:pPr>
       <w:r>
-        <w:t>Quellenverzeichnis</w:t>
+        <w:t>Literaturverzeichnis</w:t>
       </w:r>
     </w:p>
     <w:p>
       <w:pPr>
-        <w:ind w:left="454" w:hanging="454"/>
+        <w:keepNext w:val="0"/>
+        <w:ind w:left="720" w:hanging="720"/>
       </w:pPr>
       <w:r>
-        <w:t>Bickel, P. J., Hammel, E. A. &amp; O'Connell, J. W. (1975). Sex Bias in Graduate Admissions: Data from Berkeley. Science, 187(4175), 398–404.</w:t>
+        <w:rPr>
+          <w:i w:val="0"/>
+        </w:rPr>
+        <w:t xml:space="preserve">Bickel, P. J., Hammel, E. A., &amp; O'Connell, J. W. (1975). Sex bias in graduate admissions: Data from Berkeley. </w:t>
+      </w:r>
+      <w:r>
+        <w:rPr>
+          <w:i/>
+        </w:rPr>
+        <w:t>Science, 187</w:t>
+      </w:r>
+      <w:r>
+        <w:rPr>
+          <w:i w:val="0"/>
+        </w:rPr>
+        <w:t>(4175), 398–404. https://doi.org/10.1126/science.187.4175.398</w:t>
       </w:r>
     </w:p>
     <w:p>
       <w:pPr>
-        <w:ind w:left="454" w:hanging="454"/>
+        <w:keepNext w:val="0"/>
+        <w:ind w:left="720" w:hanging="720"/>
       </w:pPr>
       <w:r>
-        <w:t>McKinney, W. (2018). Datenanalyse mit Python (2., korrigierte Auflage). Heidelberg: O'Reilly. Kapitel 3: In Python integrierte Datenstrukturen, Funktionen und Dateien, Abschnitt 3.2 Funktionen, S. 71 ff.</w:t>
+        <w:rPr>
+          <w:i w:val="0"/>
+        </w:rPr>
+        <w:t xml:space="preserve">McKinney, W. (2018). </w:t>
+      </w:r>
+      <w:r>
+        <w:rPr>
+          <w:i/>
+        </w:rPr>
+        <w:t>Datenanalyse mit Python</w:t>
+      </w:r>
+      <w:r>
+        <w:rPr>
+          <w:i w:val="0"/>
+        </w:rPr>
+        <w:t xml:space="preserve"> (2., korrigierte Aufl.). O'Reilly.</w:t>
       </w:r>
     </w:p>
     <w:p>
       <w:pPr>
-        <w:ind w:left="454" w:hanging="454"/>
+        <w:keepNext w:val="0"/>
+        <w:ind w:left="720" w:hanging="720"/>
       </w:pPr>
       <w:r>
-        <w:t>Newbold, P., Carlson, W. &amp; Thorne, B. (2013). Statistics for Business and Economics (8th ed., Global Edition). Upper Saddle River, NJ: Pearson Prentice Hall.</w:t>
+        <w:rPr>
+          <w:i w:val="0"/>
+        </w:rPr>
+        <w:t xml:space="preserve">Newbold, P., Carlson, W. L., &amp; Thorne, B. M. (2013). </w:t>
+      </w:r>
+      <w:r>
+        <w:rPr>
+          <w:i/>
+        </w:rPr>
+        <w:t>Statistics for business and economics</w:t>
+      </w:r>
+      <w:r>
+        <w:rPr>
+          <w:i w:val="0"/>
+        </w:rPr>
+        <w:t xml:space="preserve"> (8. Aufl., Global Edition). Pearson.</w:t>
       </w:r>
     </w:p>
     <w:p>
       <w:pPr>
-        <w:ind w:left="454" w:hanging="454"/>
+        <w:keepNext w:val="0"/>
+        <w:ind w:left="720" w:hanging="720"/>
       </w:pPr>
       <w:r>
-        <w:t>ZHAW School of Management and Law (HS 2026). Vorlesung-Folienskript Statistik, Teil 3: Wahrscheinlichkeitsrechnung (bedingte Wahrscheinlichkeit, stochastische Unabhängigkeit).</w:t>
+        <w:rPr>
+          <w:i w:val="0"/>
+        </w:rPr>
+        <w:t xml:space="preserve">R Core Team. (o. J.). </w:t>
+      </w:r>
+      <w:r>
+        <w:rPr>
+          <w:i/>
+        </w:rPr>
+        <w:t>UCBAdmissions: Student admissions at UC Berkeley</w:t>
+      </w:r>
+      <w:r>
+        <w:rPr>
+          <w:i w:val="0"/>
+        </w:rPr>
+        <w:t xml:space="preserve"> [Datensatz]. R-Paket datasets. https://github.com/wch/r-source/blob/trunk/src/library/datasets/data/UCBAdmissions.R</w:t>
       </w:r>
     </w:p>
     <w:p>
       <w:pPr>
-        <w:ind w:left="454" w:hanging="454"/>
+        <w:keepNext w:val="0"/>
+        <w:ind w:left="720" w:hanging="720"/>
       </w:pPr>
       <w:r>
-        <w:t>ZHAW School of Management and Law (HS 2026). Aufgabe 4 (Vortrag-4: Python), Tabelle 4: UCB Admissions.</w:t>
+        <w:rPr>
+          <w:i w:val="0"/>
+        </w:rPr>
+        <w:t xml:space="preserve">Schnauss, M. (o. J.-a). </w:t>
+      </w:r>
+      <w:r>
+        <w:rPr>
+          <w:i/>
+        </w:rPr>
+        <w:t>Statistik (w.BA.XX.2Stat-WIN.XX), Teil 1: Tabellen und Diagramme</w:t>
+      </w:r>
+      <w:r>
+        <w:rPr>
+          <w:i w:val="0"/>
+        </w:rPr>
+        <w:t xml:space="preserve"> [Vorlesungsfolien]. ZHAW School of Management and Law.</w:t>
       </w:r>
     </w:p>
     <w:p>
       <w:pPr>
-        <w:ind w:left="454" w:hanging="454"/>
+        <w:keepNext w:val="0"/>
+        <w:ind w:left="720" w:hanging="720"/>
       </w:pPr>
       <w:r>
-        <w:t>R Core Team. Datensatz UCBAdmissions: Student Admissions at UC Berkeley. R-Paket datasets.</w:t>
+        <w:rPr>
+          <w:i w:val="0"/>
+        </w:rPr>
+        <w:t xml:space="preserve">Schnauss, M. (o. J.-b). </w:t>
+      </w:r>
+      <w:r>
+        <w:rPr>
+          <w:i/>
+        </w:rPr>
+        <w:t>Statistik (w.BA.XX.2Stat-WIN.XX), Teil 3: Wahrscheinlichkeitsrechnung</w:t>
+      </w:r>
+      <w:r>
+        <w:rPr>
+          <w:i w:val="0"/>
+        </w:rPr>
+        <w:t xml:space="preserve"> [Vorlesungsfolien]. ZHAW School of Management and Law.</w:t>
       </w:r>
     </w:p>
     <w:p>
       <w:pPr>
-        <w:ind w:left="454" w:hanging="454"/>
+        <w:keepNext w:val="0"/>
+        <w:ind w:left="720" w:hanging="720"/>
       </w:pPr>
       <w:r>
-        <w:t>Anhang: Jupyter-Notebook Vortrag4_Berkeley_Analyse.ipynb (vollständiger, kommentierter Python-Code).</w:t>
+        <w:rPr>
+          <w:i w:val="0"/>
+        </w:rPr>
+        <w:t xml:space="preserve">Simpson, E. H. (1951). The interpretation of interaction in contingency tables. </w:t>
+      </w:r>
+      <w:r>
+        <w:rPr>
+          <w:i/>
+        </w:rPr>
+        <w:t>Journal of the Royal Statistical Society: Series B (Methodological), 13</w:t>
+      </w:r>
+      <w:r>
+        <w:rPr>
+          <w:i w:val="0"/>
+        </w:rPr>
+        <w:t>(2), 238–241. https://doi.org/10.1111/j.2517-6161.1951.tb00088.x</w:t>
+      </w:r>
+    </w:p>
+    <w:p>
+      <w:pPr>
+        <w:keepNext w:val="0"/>
+        <w:ind w:left="720" w:hanging="720"/>
+      </w:pPr>
+      <w:r>
+        <w:rPr>
+          <w:i w:val="0"/>
+        </w:rPr>
+        <w:t xml:space="preserve">ZHAW School of Management and Law. (2019). </w:t>
+      </w:r>
+      <w:r>
+        <w:rPr>
+          <w:i/>
+        </w:rPr>
+        <w:t>Aufgabe 1 (Installation)</w:t>
+      </w:r>
+      <w:r>
+        <w:rPr>
+          <w:i w:val="0"/>
+        </w:rPr>
+        <w:t xml:space="preserve"> [Aufgabenblatt].</w:t>
+      </w:r>
+    </w:p>
+    <w:p>
+      <w:pPr>
+        <w:keepNext w:val="0"/>
+        <w:ind w:left="720" w:hanging="720"/>
+      </w:pPr>
+      <w:r>
+        <w:rPr>
+          <w:i w:val="0"/>
+        </w:rPr>
+        <w:t xml:space="preserve">ZHAW School of Management and Law. (2023). </w:t>
+      </w:r>
+      <w:r>
+        <w:rPr>
+          <w:i/>
+        </w:rPr>
+        <w:t>Semesterplan Statistik (w.BA.XX.2Stat.XX), HS 2023/24</w:t>
+      </w:r>
+      <w:r>
+        <w:rPr>
+          <w:i w:val="0"/>
+        </w:rPr>
+        <w:t xml:space="preserve"> [Semesterplan].</w:t>
+      </w:r>
+    </w:p>
+    <w:p>
+      <w:pPr>
+        <w:keepNext w:val="0"/>
+        <w:ind w:left="720" w:hanging="720"/>
+      </w:pPr>
+      <w:r>
+        <w:rPr>
+          <w:i w:val="0"/>
+        </w:rPr>
+        <w:t xml:space="preserve">ZHAW School of Management and Law. (2026). </w:t>
+      </w:r>
+      <w:r>
+        <w:rPr>
+          <w:i/>
+        </w:rPr>
+        <w:t>Aufgabe 4 (Vortrag-4: Python)</w:t>
+      </w:r>
+      <w:r>
+        <w:rPr>
+          <w:i w:val="0"/>
+        </w:rPr>
+        <w:t xml:space="preserve"> [Aufgabenblatt].</w:t>
+      </w:r>
+    </w:p>
+    <w:p>
+      <w:pPr>
+        <w:pStyle w:val="Heading2"/>
+      </w:pPr>
+      <w:r>
+        <w:t>Anhang</w:t>
+      </w:r>
+    </w:p>
+    <w:p>
+      <w:pPr>
+        <w:keepNext w:val="0"/>
+      </w:pPr>
+      <w:r>
+        <w:rPr>
+          <w:i w:val="0"/>
+        </w:rPr>
+        <w:t>Jupyter-Notebook Vortrag4_Berkeley_Analyse.ipynb (vollständiger, kommentierter Python-Code mit allen Ausgaben und Abbildungen).</w:t>
       </w:r>
     </w:p>
     <w:sectPr>

</xml_diff>

<commit_message>
Titel korrigiert (Simpson-Paradoxon), Rundungshinweise ergänzt
- Selbst erfundenen Titel «Berkeley-Paradoxon» durch den Fachbegriff
  «Simpson-Paradoxon an der UC Berkeley» ersetzt (Ausarbeitung, Notebook,
  Folien, README)
- Hinweis ergänzt, dass Differenzen aus den ungerundeten Anzahlen stammen
  (C: −2.9 statt −2.8 aus gerundeten Werten; 14.2 statt 14.1)

Co-Authored-By: Claude Opus 5.5 <noreply@anthropic.com>
Claude-Session: https://claude.ai/code/session_013vrRC9ggswsEWMp2ebeFzZ
</commit_message>
<xml_diff>
--- a/vortrag4/Vortrag4_Ausarbeitung.docx
+++ b/vortrag4/Vortrag4_Ausarbeitung.docx
@@ -16,7 +16,9 @@
           <w:b/>
           <w:sz w:val="48"/>
         </w:rPr>
-        <w:t>Das Berkeley-Paradoxon</w:t>
+        <w:t>Das Simpson-Paradoxon</w:t>
+        <w:br/>
+        <w:t>an der UC Berkeley</w:t>
       </w:r>
     </w:p>
     <w:p>
@@ -27,7 +29,7 @@
         <w:rPr>
           <w:sz w:val="28"/>
         </w:rPr>
-        <w:t>Zulassungen an der UC Berkeley 1973: Funktionen in Python,</w:t>
+        <w:t>Zulassungen 1973: Funktionen in Python,</w:t>
         <w:br/>
         <w:t>Visualisierung und stochastische Unabhängigkeit</w:t>
       </w:r>
@@ -2991,7 +2993,7 @@
         <w:rPr>
           <w:i w:val="0"/>
         </w:rPr>
-        <w:t>Innerhalb der Fachbereiche zeigt sich ein anderes Bild (Abbildung 2). In vier von sechs Fachbereichen (A, B, D, F) haben Frauen die höhere Zulassungsquote, in A sogar um 20.3 Prozentpunkte. In C und E liegen die Männer mit 2.9 bzw. 3.8 Prozentpunkten leicht vorne. Eine systematische Benachteiligung von Frauen ist auf Ebene der Fachbereiche, die über die Zulassung entscheiden, nicht erkennbar.</w:t>
+        <w:t>Innerhalb der Fachbereiche zeigt sich ein anderes Bild (Abbildung 2). In vier von sechs Fachbereichen (A, B, D, F) haben Frauen die höhere Zulassungsquote, in A sogar um 20.3 Prozentpunkte. In C und E liegen die Männer mit 2.9 bzw. 3.8 Prozentpunkten leicht vorne (Differenzen aus den ungerundeten Anzahlen; mit den gerundeten Werten aus Tabelle 4 ergibt sich für C −2.8). Eine systematische Benachteiligung von Frauen ist auf Ebene der Fachbereiche, die über die Zulassung entscheiden, nicht erkennbar.</w:t>
       </w:r>
     </w:p>
     <w:p>
@@ -4909,7 +4911,7 @@
         <w:rPr>
           <w:sz w:val="19"/>
         </w:rPr>
-        <w:t>Eigene Berechnung. PP = Prozentpunkte (Frauen minus Männer). Daten aus Bickel et al. (1975) bzw. R Core Team (o. J.).</w:t>
+        <w:t>Eigene Berechnung aus den ungerundeten Anzahlen. PP = Prozentpunkte (Frauen minus Männer). Daten aus Bickel et al. (1975) bzw. R Core Team (o. J.).</w:t>
       </w:r>
     </w:p>
     <w:p>

</xml_diff>

<commit_message>
Inhaltliche Überarbeitung: Aussagen an Quellen und Daten angepasst
- Befund von Bickel et al. (1975) genauer wiedergegeben
- Simpson-Paradoxon: «kann auftreten» statt «tritt auf»; Beispielcharakter
  der Berkeley-Daten wie in der Quelle formuliert
- Zulassungsquoten in Tabelle 4 korrekt als P(Z | W, F_i) bezeichnet
- «knapp zwei Drittel» statt «rund zwei Drittel» (64.4 % und 63.2 %)
- Fazit: «keine systematische Benachteiligung» statt «nicht benachteiligt»
- Zu lange Codezeilen in der Ausarbeitung gekürzt

Co-Authored-By: Claude Opus 5.5 <noreply@anthropic.com>
Claude-Session: https://claude.ai/code/session_013vrRC9ggswsEWMp2ebeFzZ
</commit_message>
<xml_diff>
--- a/vortrag4/Vortrag4_Ausarbeitung.docx
+++ b/vortrag4/Vortrag4_Ausarbeitung.docx
@@ -436,7 +436,7 @@
         </w:rPr>
         <w:t>6 Vergleich der Verteilungen und Interpretation (Aufgabe c)</w:t>
         <w:tab/>
-        <w:t>10</w:t>
+        <w:t>9</w:t>
       </w:r>
     </w:p>
     <w:p>
@@ -453,7 +453,7 @@
         </w:rPr>
         <w:t>6.1 Zulassungsquoten innerhalb der Fachbereiche</w:t>
         <w:tab/>
-        <w:t>10</w:t>
+        <w:t>9</w:t>
       </w:r>
     </w:p>
     <w:p>
@@ -578,7 +578,7 @@
         <w:rPr>
           <w:i w:val="0"/>
         </w:rPr>
-        <w:t>Im Herbst 1973 gingen an den sechs grössten Fachbereichen (A bis F) der University of California, Berkeley, 4 526 Bewerbungen für ein Graduate-Studium ein. Über alle sechs Fachbereiche zusammen wurden 44.5 % der Männer, aber nur 30.4 % der Frauen zugelassen (R Core Team, o. J.). Bickel et al. (1975) untersuchten die Berkeley-Zahlen auf eine Benachteiligung von Frauen und zeigten, dass der Unterschied auf Ebene der Fachbereiche verschwindet. Tabelle 4 der Aufgabenstellung (ZHAW School of Management and Law [ZHAW SML], 2026) fasst die Daten zusammen: je Fachbereich die Zulassungsquote getrennt nach Geschlecht und den Anteil der Bewerbungen, der auf den Fachbereich entfällt.</w:t>
+        <w:t>Im Herbst 1973 gingen an den sechs grössten Fachbereichen (A bis F) der University of California, Berkeley, 4 526 Bewerbungen für ein Graduate-Studium ein. Über alle sechs Fachbereiche zusammen wurden 44.5 % der Männer, aber nur 30.4 % der Frauen zugelassen (R Core Team, o. J.). Bickel et al. (1975) untersuchten die Berkeley-Zahlen auf eine Benachteiligung von Frauen und fanden auf Ebene der Fachbereiche keine Benachteiligung von Frauen. Tabelle 4 der Aufgabenstellung (ZHAW School of Management and Law [ZHAW SML], 2026) fasst die Daten zusammen: je Fachbereich die Zulassungsquote getrennt nach Geschlecht und den Anteil der Bewerbungen, der auf den Fachbereich entfällt.</w:t>
       </w:r>
     </w:p>
     <w:p>
@@ -885,7 +885,7 @@
           <w:rFonts w:ascii="Consolas" w:hAnsi="Consolas" w:eastAsia="Consolas"/>
           <w:sz w:val="18"/>
         </w:rPr>
-        <w:t xml:space="preserve">    return {"P(Z)": p_z, "P(W)": p_w, "P(Z∩W)": p_z_und_w, "P(Z)·P(W)": p_z * p_w, ...}</w:t>
+        <w:t xml:space="preserve">    return {"P(Z)": p_z, "P(Z∩W)": p_z_und_w, "P(Z)·P(W)": p_z * p_w, ...}</w:t>
       </w:r>
     </w:p>
     <w:p>
@@ -1069,7 +1069,7 @@
           <w:rFonts w:ascii="Consolas" w:hAnsi="Consolas" w:eastAsia="Consolas"/>
           <w:sz w:val="18"/>
         </w:rPr>
-        <w:t>ax.yaxis.set_major_formatter(lambda y, _: f"{y:.0%}")     # Achsenbeschriftung in Prozent</w:t>
+        <w:t>ax.yaxis.set_major_formatter(lambda y, _: f"{y:.0%}")     # Achse in %</w:t>
         <w:br/>
       </w:r>
       <w:r>
@@ -1498,7 +1498,31 @@
         <w:rPr>
           <w:i w:val="0"/>
         </w:rPr>
-        <w:t>). Zwei Ereignisse sind stochastisch unabhängig, wenn die Wahrscheinlichkeit des einen nicht vom Eintreten des anderen abhängt (Schnauss, o. J.-b, Folie 34):</w:t>
+        <w:t xml:space="preserve">, </w:t>
+      </w:r>
+      <w:r>
+        <w:rPr>
+          <w:i/>
+        </w:rPr>
+        <w:t>F</w:t>
+      </w:r>
+      <w:r>
+        <w:rPr>
+          <w:i w:val="0"/>
+        </w:rPr>
+        <w:t xml:space="preserve">ᵢ) für Frauen in Fachbereich </w:t>
+      </w:r>
+      <w:r>
+        <w:rPr>
+          <w:i/>
+        </w:rPr>
+        <w:t>F</w:t>
+      </w:r>
+      <w:r>
+        <w:rPr>
+          <w:i w:val="0"/>
+        </w:rPr>
+        <w:t>ᵢ. Zwei Ereignisse sind stochastisch unabhängig, wenn die Wahrscheinlichkeit des einen nicht vom Eintreten des anderen abhängt (Schnauss, o. J.-b, Folie 34):</w:t>
       </w:r>
     </w:p>
     <w:p>
@@ -2363,7 +2387,7 @@
         <w:rPr>
           <w:i w:val="0"/>
         </w:rPr>
-        <w:t xml:space="preserve">Ein Zusammenhang zwischen zwei Merkmalen kann sich abschwächen, verschwinden oder sogar umkehren, wenn man Daten aus mehreren Gruppen zusammenfasst. Dieses Phänomen heisst nach Simpson (1951) Simpson-Paradoxon. Es tritt auf, wenn eine Drittvariable, hier der Fachbereich, sowohl mit dem Geschlecht als auch mit der Zulassung zusammenhängt. Die Berkeley-Daten gelten als das bekannteste Beispiel dafür (Bickel et al., 1975; R Core Team, o. J.). Für die Unabhängigkeit bedeutet das: </w:t>
+        <w:t xml:space="preserve">Ein Zusammenhang zwischen zwei Merkmalen kann sich abschwächen, verschwinden oder sogar umkehren, wenn man Daten aus mehreren Gruppen zusammenfasst. Dieses Phänomen heisst nach Simpson (1951) Simpson-Paradoxon. Es kann auftreten, wenn eine Drittvariable, hier der Fachbereich, sowohl mit dem Geschlecht als auch mit der Zulassung zusammenhängt. Die Berkeley-Daten werden häufig zur Veranschaulichung verwendet (Bickel et al., 1975; R Core Team, o. J.). Für die Unabhängigkeit bedeutet das: </w:t>
       </w:r>
       <w:r>
         <w:rPr>
@@ -3093,7 +3117,7 @@
         <w:rPr>
           <w:i w:val="0"/>
         </w:rPr>
-        <w:t>Die beiden Geschlechter verteilen sich sehr unterschiedlich auf die Fachbereiche (Abbildung 3). 51.5 % der Männer bewarben sich in A oder B, wo rund zwei Drittel der Bewerbungen erfolgreich sind. Von den Frauen taten dies nur 7.2 %; 92.8 % bewarben sich in C bis F, wo die Quoten zwischen 6 % und 35 % liegen.</w:t>
+        <w:t>Die beiden Geschlechter verteilen sich sehr unterschiedlich auf die Fachbereiche (Abbildung 3). 51.5 % der Männer bewarben sich in A oder B, wo knapp zwei Drittel der Bewerbungen erfolgreich sind. Von den Frauen taten dies nur 7.2 %; 92.8 % bewarben sich in C bis F, wo die Quoten zwischen 6 % und 35 % liegen.</w:t>
       </w:r>
     </w:p>
     <w:p>
@@ -3185,7 +3209,7 @@
         <w:rPr>
           <w:i w:val="0"/>
         </w:rPr>
-        <w:t>Abbildung 4 fasst beides je Fachbereich zusammen: Je höher der Frauenanteil unter den Bewerbungen, desto tiefer die Zulassungsquote des Fachbereichs (Korrelation r = −0.79).</w:t>
+        <w:t>Abbildung 4 fasst beides je Fachbereich zusammen: Je höher der Frauenanteil unter den Bewerbungen, desto tiefer die Zulassungsquote des Fachbereichs (Korrelation über die sechs Fachbereiche: r = −0.79).</w:t>
       </w:r>
     </w:p>
     <w:p>
@@ -5036,7 +5060,7 @@
         <w:rPr>
           <w:i w:val="0"/>
         </w:rPr>
-        <w:t>Die aggregierte Darstellung aus Aufgabe (b) legt eine klare Benachteiligung von Frauen nahe. Der Vergleich der Verteilungen in Aufgabe (c) zeigt jedoch, dass die Fachbereiche, die über die Zulassung entscheiden, Frauen nicht benachteiligten. Zulassung und Geschlecht sind insgesamt stochastisch abhängig, innerhalb der Fachbereiche aber annähernd unabhängig, mit Fachbereich A als Ausnahme zugunsten der Frauen. Der Unterschied entsteht dadurch, dass sich Frauen häufiger in stark umkämpften Fachbereichen mit tiefen Zulassungsquoten bewarben. Das bestätigt den Befund von Bickel et al. (1975).</w:t>
+        <w:t>Die aggregierte Darstellung aus Aufgabe (b) legt eine klare Benachteiligung von Frauen nahe. Der Vergleich der Verteilungen in Aufgabe (c) zeigt jedoch, dass sich in den Fachbereichen, die über die Zulassung entscheiden, keine systematische Benachteiligung von Frauen erkennen lässt. Zulassung und Geschlecht sind insgesamt stochastisch abhängig, innerhalb der Fachbereiche aber annähernd unabhängig, mit Fachbereich A als Ausnahme zugunsten der Frauen. Der Unterschied entsteht dadurch, dass sich Frauen häufiger in stark umkämpften Fachbereichen mit tiefen Zulassungsquoten bewarben. Das steht im Einklang mit dem Befund von Bickel et al. (1975).</w:t>
       </w:r>
     </w:p>
     <w:p>

</xml_diff>